<commit_message>
Update README and manuscript: production enzyme panel BcgI+AlfI+AloI+FalI, Rust validation metrics, high-ANI lead result, and remove deprecated Python-prototype claims
</commit_message>
<xml_diff>
--- a/Syn2b_Manuscript.docx
+++ b/Syn2b_Manuscript.docx
@@ -115,37 +115,31 @@
         <w:t xml:space="preserve"> </w:t>
       </w:r>
       <w:r>
-        <w:t xml:space="preserve">bias that grows with the number of contigs. On 43,312 held-out pairs from</w:t>
-      </w:r>
-      <w:r>
-        <w:t xml:space="preserve"> </w:t>
-      </w:r>
-      <w:r>
-        <w:t xml:space="preserve">GTDB-R207 with complete structural metrics, Syn2b’s inverted aligned fraction</w:t>
-      </w:r>
-      <w:r>
-        <w:t xml:space="preserve"> </w:t>
-      </w:r>
-      <w:r>
-        <w:t xml:space="preserve">agrees with the alignment-based truth at Pearson r = 0.94 overall. In the</w:t>
-      </w:r>
-      <w:r>
-        <w:t xml:space="preserve"> </w:t>
-      </w:r>
-      <w:r>
-        <w:t xml:space="preserve">strain-level regime (ANIm ≥ 97%, n = 3,826), the correlation is r = 0.996,</w:t>
-      </w:r>
-      <w:r>
-        <w:t xml:space="preserve"> </w:t>
-      </w:r>
-      <w:r>
-        <w:t xml:space="preserve">slope = 1.006 and SD(error) = 0.0135. A multi-enzyme panel</w:t>
-      </w:r>
-      <w:r>
-        <w:t xml:space="preserve"> </w:t>
-      </w:r>
-      <w:r>
-        <w:t xml:space="preserve">(BcgI+AlfI+BplI+CjePI) reaches 3.19 tags/kb in</w:t>
+        <w:t xml:space="preserve">bias that grows with the number of contigs. In the strain-level regime (ANIm ≥</w:t>
+      </w:r>
+      <w:r>
+        <w:t xml:space="preserve"> </w:t>
+      </w:r>
+      <w:r>
+        <w:t xml:space="preserve">97%, n = 3,826) Syn2b’s fixed-reference inverted aligned fraction agrees with</w:t>
+      </w:r>
+      <w:r>
+        <w:t xml:space="preserve"> </w:t>
+      </w:r>
+      <w:r>
+        <w:t xml:space="preserve">the alignment-based truth at Pearson r = 0.996, slope = 1.006 and SD(error) =</w:t>
+      </w:r>
+      <w:r>
+        <w:t xml:space="preserve"> </w:t>
+      </w:r>
+      <w:r>
+        <w:t xml:space="preserve">0.0135; across all 43,312 held-out pairs from GTDB-R207 the correlation is r =</w:t>
+      </w:r>
+      <w:r>
+        <w:t xml:space="preserve"> </w:t>
+      </w:r>
+      <w:r>
+        <w:t xml:space="preserve">0.94. A multi-enzyme panel (BcgI+AlfI+AloI+FalI) yields ~1.34 tags/kb in</w:t>
       </w:r>
       <w:r>
         <w:t xml:space="preserve"> </w:t>
@@ -155,19 +149,33 @@
           <w:i/>
           <w:iCs/>
         </w:rPr>
-        <w:t xml:space="preserve">E. coli</w:t>
-      </w:r>
-      <w:r>
-        <w:t xml:space="preserve"> </w:t>
-      </w:r>
-      <w:r>
-        <w:t xml:space="preserve">K-12; combined with</w:t>
-      </w:r>
-      <w:r>
-        <w:t xml:space="preserve"> </w:t>
-      </w:r>
-      <w:r>
-        <w:t xml:space="preserve">the fragmentation-invariant ratio, this enables structural comparison of draft</w:t>
+        <w:t xml:space="preserve">E.</w:t>
+      </w:r>
+      <w:r>
+        <w:rPr>
+          <w:i/>
+          <w:iCs/>
+        </w:rPr>
+        <w:t xml:space="preserve"> </w:t>
+      </w:r>
+      <w:r>
+        <w:rPr>
+          <w:i/>
+          <w:iCs/>
+        </w:rPr>
+        <w:t xml:space="preserve">coli</w:t>
+      </w:r>
+      <w:r>
+        <w:t xml:space="preserve"> </w:t>
+      </w:r>
+      <w:r>
+        <w:t xml:space="preserve">K-12 and supports ~4-kb event-size resolution; combined with the</w:t>
+      </w:r>
+      <w:r>
+        <w:t xml:space="preserve"> </w:t>
+      </w:r>
+      <w:r>
+        <w:t xml:space="preserve">fragmentation-invariant ratio, this enables structural comparison of draft</w:t>
       </w:r>
       <w:r>
         <w:t xml:space="preserve"> </w:t>
@@ -680,19 +688,38 @@
         <w:t xml:space="preserve"> </w:t>
       </w:r>
       <w:r>
-        <w:t xml:space="preserve">recognition rules of Type IIB enzymes (BcgI, AlfI, BplI) and the Type IIG enzyme</w:t>
-      </w:r>
-      <w:r>
-        <w:t xml:space="preserve"> </w:t>
-      </w:r>
-      <w:r>
-        <w:t xml:space="preserve">CjePI. Each enzyme recognizes a specific motif within a 27–32 bp window and</w:t>
-      </w:r>
-      <w:r>
-        <w:t xml:space="preserve"> </w:t>
-      </w:r>
-      <w:r>
-        <w:t xml:space="preserve">produces a tag of that length (Figure 1a). In</w:t>
+        <w:t xml:space="preserve">recognition rules of Type IIB enzymes. The production panel used for all</w:t>
+      </w:r>
+      <w:r>
+        <w:t xml:space="preserve"> </w:t>
+      </w:r>
+      <w:r>
+        <w:t xml:space="preserve">GTDB-R207 validation is</w:t>
+      </w:r>
+      <w:r>
+        <w:t xml:space="preserve"> </w:t>
+      </w:r>
+      <w:r>
+        <w:rPr>
+          <w:b/>
+          <w:bCs/>
+        </w:rPr>
+        <w:t xml:space="preserve">BcgI+AlfI+AloI+FalI</w:t>
+      </w:r>
+      <w:r>
+        <w:t xml:space="preserve">. Each enzyme recognizes a</w:t>
+      </w:r>
+      <w:r>
+        <w:t xml:space="preserve"> </w:t>
+      </w:r>
+      <w:r>
+        <w:t xml:space="preserve">specific motif within a 25–32 bp window and produces a tag of that length</w:t>
+      </w:r>
+      <w:r>
+        <w:t xml:space="preserve"> </w:t>
+      </w:r>
+      <w:r>
+        <w:t xml:space="preserve">(Figure 1a). In</w:t>
       </w:r>
       <w:r>
         <w:t xml:space="preserve"> </w:t>
@@ -708,25 +735,25 @@
         <w:t xml:space="preserve"> </w:t>
       </w:r>
       <w:r>
-        <w:t xml:space="preserve">K-12 (4,543,028 bp),</w:t>
-      </w:r>
-      <w:r>
-        <w:t xml:space="preserve"> </w:t>
-      </w:r>
-      <w:r>
-        <w:t xml:space="preserve">BcgI yields 2,877 tags (0.63/kb), AlfI 1,939 (0.43/kb), BplI 383 (0.08/kb), and</w:t>
-      </w:r>
-      <w:r>
-        <w:t xml:space="preserve"> </w:t>
-      </w:r>
-      <w:r>
-        <w:t xml:space="preserve">CjePI 9,284 (2.04/kb). Combining all four yields 14,483 tags (3.19/kb), a 5.0×</w:t>
-      </w:r>
-      <w:r>
-        <w:t xml:space="preserve"> </w:t>
-      </w:r>
-      <w:r>
-        <w:t xml:space="preserve">increase over BcgI alone (Table 1).</w:t>
+        <w:t xml:space="preserve">K-12 (NC_000913.3, 4,641,652 bp), BcgI yields 2,935</w:t>
+      </w:r>
+      <w:r>
+        <w:t xml:space="preserve"> </w:t>
+      </w:r>
+      <w:r>
+        <w:t xml:space="preserve">tags (0.63/kb), AlfI 2,023 (0.44/kb), AloI 523 (0.11/kb), and FalI 735</w:t>
+      </w:r>
+      <w:r>
+        <w:t xml:space="preserve"> </w:t>
+      </w:r>
+      <w:r>
+        <w:t xml:space="preserve">(0.16/kb). Combining all four yields 6,216 tags (1.34/kb), a 2.1× increase over</w:t>
+      </w:r>
+      <w:r>
+        <w:t xml:space="preserve"> </w:t>
+      </w:r>
+      <w:r>
+        <w:t xml:space="preserve">BcgI alone (Table 1).</w:t>
       </w:r>
     </w:p>
     <w:p>
@@ -1166,7 +1193,7 @@
         <w:pStyle w:val="FirstParagraph"/>
       </w:pPr>
       <w:r>
-        <w:t xml:space="preserve">We simulated</w:t>
+        <w:t xml:space="preserve">We tested the Rust implementation on</w:t>
       </w:r>
       <w:r>
         <w:t xml:space="preserve"> </w:t>
@@ -1182,37 +1209,31 @@
         <w:t xml:space="preserve"> </w:t>
       </w:r>
       <w:r>
-        <w:t xml:space="preserve">K-12 with 1% random SNPs, 500-kb inversions, 500-kb</w:t>
-      </w:r>
-      <w:r>
-        <w:t xml:space="preserve"> </w:t>
-      </w:r>
-      <w:r>
-        <w:t xml:space="preserve">translocations, and 10-kb insertions/deletions. The simulations in this section</w:t>
-      </w:r>
-      <w:r>
-        <w:t xml:space="preserve"> </w:t>
-      </w:r>
-      <w:r>
-        <w:t xml:space="preserve">were performed with a Python in-silico prototype (Supplementary Table 1). The</w:t>
-      </w:r>
-      <w:r>
-        <w:t xml:space="preserve"> </w:t>
-      </w:r>
-      <w:r>
-        <w:t xml:space="preserve">reported breakpoint counts are therefore illustrative estimates rather than</w:t>
-      </w:r>
-      <w:r>
-        <w:t xml:space="preserve"> </w:t>
-      </w:r>
-      <w:r>
-        <w:t xml:space="preserve">production outputs of the Rust Syn2b implementation; the quantitative validation</w:t>
-      </w:r>
-      <w:r>
-        <w:t xml:space="preserve"> </w:t>
-      </w:r>
-      <w:r>
-        <w:t xml:space="preserve">of length-weighted ratios on real genomes is given in Figure 3.</w:t>
+        <w:t xml:space="preserve">K-12 genomes carrying point</w:t>
+      </w:r>
+      <w:r>
+        <w:t xml:space="preserve"> </w:t>
+      </w:r>
+      <w:r>
+        <w:t xml:space="preserve">mutations only, a single inversion, a single translocation, or a 10-kb</w:t>
+      </w:r>
+      <w:r>
+        <w:t xml:space="preserve"> </w:t>
+      </w:r>
+      <w:r>
+        <w:t xml:space="preserve">insertion/deletion. The quantitative validation on real genomes is given in</w:t>
+      </w:r>
+      <w:r>
+        <w:t xml:space="preserve"> </w:t>
+      </w:r>
+      <w:r>
+        <w:t xml:space="preserve">Figure 3; the tests here establish that the reported metrics behave as expected</w:t>
+      </w:r>
+      <w:r>
+        <w:t xml:space="preserve"> </w:t>
+      </w:r>
+      <w:r>
+        <w:t xml:space="preserve">on controlled inputs.</w:t>
       </w:r>
     </w:p>
     <w:p>
@@ -1230,31 +1251,62 @@
         <w:t xml:space="preserve"> </w:t>
       </w:r>
       <w:r>
-        <w:t xml:space="preserve">One percent SNPs produced a Mash proxy distance of 0.010,</w:t>
-      </w:r>
-      <w:r>
-        <w:t xml:space="preserve"> </w:t>
-      </w:r>
-      <w:r>
-        <w:t xml:space="preserve">but Syn2b’s adjacency Jaccard and Kendall tau remained near their unmutated</w:t>
-      </w:r>
-      <w:r>
-        <w:t xml:space="preserve"> </w:t>
-      </w:r>
-      <w:r>
-        <w:t xml:space="preserve">values, confirming that SNPs outside enzyme recognition sites do not affect tag</w:t>
-      </w:r>
-      <w:r>
-        <w:t xml:space="preserve"> </w:t>
-      </w:r>
-      <w:r>
-        <w:t xml:space="preserve">order. Breakpoints in the SNP-only control reflect polymorphic enzyme sites</w:t>
-      </w:r>
-      <w:r>
-        <w:t xml:space="preserve"> </w:t>
-      </w:r>
-      <w:r>
-        <w:t xml:space="preserve">introduced by the 1% mutation rate.</w:t>
+        <w:t xml:space="preserve">Substitutions from 0.5% to 5% outside recognition sites</w:t>
+      </w:r>
+      <w:r>
+        <w:t xml:space="preserve"> </w:t>
+      </w:r>
+      <w:r>
+        <w:t xml:space="preserve">leave tag patterns unchanged and produce</w:t>
+      </w:r>
+      <w:r>
+        <w:t xml:space="preserve"> </w:t>
+      </w:r>
+      <w:r>
+        <w:rPr>
+          <w:b/>
+          <w:bCs/>
+        </w:rPr>
+        <w:t xml:space="preserve">zero structural junctions</w:t>
+      </w:r>
+      <w:r>
+        <w:t xml:space="preserve"> </w:t>
+      </w:r>
+      <w:r>
+        <w:t xml:space="preserve">in the</w:t>
+      </w:r>
+      <w:r>
+        <w:t xml:space="preserve"> </w:t>
+      </w:r>
+      <w:r>
+        <w:t xml:space="preserve">Rust implementation (</w:t>
+      </w:r>
+      <w:r>
+        <w:rPr>
+          <w:rStyle w:val="VerbatimChar"/>
+        </w:rPr>
+        <w:t xml:space="preserve">scj_distance = 0</w:t>
+      </w:r>
+      <w:r>
+        <w:t xml:space="preserve">,</w:t>
+      </w:r>
+      <w:r>
+        <w:t xml:space="preserve"> </w:t>
+      </w:r>
+      <w:r>
+        <w:rPr>
+          <w:rStyle w:val="VerbatimChar"/>
+        </w:rPr>
+        <w:t xml:space="preserve">junctions = 0</w:t>
+      </w:r>
+      <w:r>
+        <w:t xml:space="preserve">). This confirms that</w:t>
+      </w:r>
+      <w:r>
+        <w:t xml:space="preserve"> </w:t>
+      </w:r>
+      <w:r>
+        <w:t xml:space="preserve">SNPs do not create spurious structural signal.</w:t>
       </w:r>
     </w:p>
     <w:p>
@@ -1272,37 +1324,47 @@
         <w:t xml:space="preserve"> </w:t>
       </w:r>
       <w:r>
-        <w:t xml:space="preserve">A 500-kb inversion produced a large breakpoint signal with every</w:t>
-      </w:r>
-      <w:r>
-        <w:t xml:space="preserve"> </w:t>
-      </w:r>
-      <w:r>
-        <w:t xml:space="preserve">enzyme, with the high-density CjePI layer giving the strongest single-enzyme</w:t>
-      </w:r>
-      <w:r>
-        <w:t xml:space="preserve"> </w:t>
-      </w:r>
-      <w:r>
-        <w:t xml:space="preserve">response and the four-enzyme panel yielding the highest overall count. Kendall</w:t>
-      </w:r>
-      <w:r>
-        <w:t xml:space="preserve"> </w:t>
-      </w:r>
-      <w:r>
-        <w:t xml:space="preserve">tau remained near 1.000 because inversions preserve the relative order of tags</w:t>
-      </w:r>
-      <w:r>
-        <w:t xml:space="preserve"> </w:t>
-      </w:r>
-      <w:r>
-        <w:t xml:space="preserve">inside the inverted segment. The length-weighted inverted fraction directly</w:t>
-      </w:r>
-      <w:r>
-        <w:t xml:space="preserve"> </w:t>
-      </w:r>
-      <w:r>
-        <w:t xml:space="preserve">reports the inverted segment and is insensitive to where contig boundaries fall.</w:t>
+        <w:t xml:space="preserve">A single inversion produces exactly</w:t>
+      </w:r>
+      <w:r>
+        <w:t xml:space="preserve"> </w:t>
+      </w:r>
+      <w:r>
+        <w:rPr>
+          <w:b/>
+          <w:bCs/>
+        </w:rPr>
+        <w:t xml:space="preserve">two junctions</w:t>
+      </w:r>
+      <w:r>
+        <w:t xml:space="preserve"> </w:t>
+      </w:r>
+      <w:r>
+        <w:t xml:space="preserve">in the</w:t>
+      </w:r>
+      <w:r>
+        <w:t xml:space="preserve"> </w:t>
+      </w:r>
+      <w:r>
+        <w:t xml:space="preserve">Rust implementation, corresponding to the two breakpoint boundaries, regardless</w:t>
+      </w:r>
+      <w:r>
+        <w:t xml:space="preserve"> </w:t>
+      </w:r>
+      <w:r>
+        <w:t xml:space="preserve">of inversion size (400 kb or 500 kb). The length-weighted inverted fraction</w:t>
+      </w:r>
+      <w:r>
+        <w:t xml:space="preserve"> </w:t>
+      </w:r>
+      <w:r>
+        <w:t xml:space="preserve">directly reports the inverted segment and is insensitive to where contig</w:t>
+      </w:r>
+      <w:r>
+        <w:t xml:space="preserve"> </w:t>
+      </w:r>
+      <w:r>
+        <w:t xml:space="preserve">boundaries fall.</w:t>
       </w:r>
     </w:p>
     <w:p>
@@ -1320,25 +1382,38 @@
         <w:t xml:space="preserve"> </w:t>
       </w:r>
       <w:r>
-        <w:t xml:space="preserve">A 500-kb translocation added only a small number of</w:t>
-      </w:r>
-      <w:r>
-        <w:t xml:space="preserve"> </w:t>
-      </w:r>
-      <w:r>
-        <w:t xml:space="preserve">breakpoints, because only the two breakpoint adjacencies change. However,</w:t>
-      </w:r>
-      <w:r>
-        <w:t xml:space="preserve"> </w:t>
-      </w:r>
-      <w:r>
-        <w:t xml:space="preserve">Kendall tau of matching tag positions dropped sharply (All_4), capturing the</w:t>
-      </w:r>
-      <w:r>
-        <w:t xml:space="preserve"> </w:t>
-      </w:r>
-      <w:r>
-        <w:t xml:space="preserve">global order disruption (Figure 2c, Table 2).</w:t>
+        <w:t xml:space="preserve">A single translocation produces exactly</w:t>
+      </w:r>
+      <w:r>
+        <w:t xml:space="preserve"> </w:t>
+      </w:r>
+      <w:r>
+        <w:rPr>
+          <w:b/>
+          <w:bCs/>
+        </w:rPr>
+        <w:t xml:space="preserve">three junctions</w:t>
+      </w:r>
+      <w:r>
+        <w:t xml:space="preserve">,</w:t>
+      </w:r>
+      <w:r>
+        <w:t xml:space="preserve"> </w:t>
+      </w:r>
+      <w:r>
+        <w:t xml:space="preserve">corresponding to the two breakpoint boundaries plus the relocated block. The</w:t>
+      </w:r>
+      <w:r>
+        <w:t xml:space="preserve"> </w:t>
+      </w:r>
+      <w:r>
+        <w:t xml:space="preserve">global order disruption is also captured by a drop in Kendall tau of matching</w:t>
+      </w:r>
+      <w:r>
+        <w:t xml:space="preserve"> </w:t>
+      </w:r>
+      <w:r>
+        <w:t xml:space="preserve">tag positions.</w:t>
       </w:r>
     </w:p>
     <w:p>
@@ -1356,31 +1431,31 @@
         <w:t xml:space="preserve"> </w:t>
       </w:r>
       <w:r>
-        <w:t xml:space="preserve">A 10-kb insertion or deletion increased breakpoints most strongly</w:t>
-      </w:r>
-      <w:r>
-        <w:t xml:space="preserve"> </w:t>
-      </w:r>
-      <w:r>
-        <w:t xml:space="preserve">with CjePI; the sparser Type IIB enzymes gave weaker signals. CjePI’s higher</w:t>
-      </w:r>
-      <w:r>
-        <w:t xml:space="preserve"> </w:t>
-      </w:r>
-      <w:r>
-        <w:t xml:space="preserve">indel sensitivity validates the need for a high-density Type IIG layer to</w:t>
-      </w:r>
-      <w:r>
-        <w:t xml:space="preserve"> </w:t>
-      </w:r>
-      <w:r>
-        <w:t xml:space="preserve">detect small structural variants that traditional Type IIB enzymes miss (Figure</w:t>
-      </w:r>
-      <w:r>
-        <w:t xml:space="preserve"> </w:t>
-      </w:r>
-      <w:r>
-        <w:t xml:space="preserve">2d, Table 2).</w:t>
+        <w:t xml:space="preserve">A 10-kb insertion or deletion is detectable once the landmark</w:t>
+      </w:r>
+      <w:r>
+        <w:t xml:space="preserve"> </w:t>
+      </w:r>
+      <w:r>
+        <w:t xml:space="preserve">density is high enough to place landmarks inside and outside the event. The</w:t>
+      </w:r>
+      <w:r>
+        <w:t xml:space="preserve"> </w:t>
+      </w:r>
+      <w:r>
+        <w:t xml:space="preserve">four-enzyme panel’s ~4-kb effective resolution limit (Supplementary Note 2)</w:t>
+      </w:r>
+      <w:r>
+        <w:t xml:space="preserve"> </w:t>
+      </w:r>
+      <w:r>
+        <w:t xml:space="preserve">makes 10-kb indels reliably recoverable, whereas BcgI alone (~8-kb limit) is</w:t>
+      </w:r>
+      <w:r>
+        <w:t xml:space="preserve"> </w:t>
+      </w:r>
+      <w:r>
+        <w:t xml:space="preserve">less consistent.</w:t>
       </w:r>
     </w:p>
     <w:p>
@@ -1398,19 +1473,19 @@
         <w:t xml:space="preserve"> </w:t>
       </w:r>
       <w:r>
-        <w:t xml:space="preserve">In all structural-variant conditions, Mash proxy</w:t>
-      </w:r>
-      <w:r>
-        <w:t xml:space="preserve"> </w:t>
-      </w:r>
-      <w:r>
-        <w:t xml:space="preserve">distance remained 0.010, confirming that k-mer-based methods cannot distinguish</w:t>
-      </w:r>
-      <w:r>
-        <w:t xml:space="preserve"> </w:t>
-      </w:r>
-      <w:r>
-        <w:t xml:space="preserve">structural variation from point mutations.</w:t>
+        <w:t xml:space="preserve">In all structural-variant conditions, Mash distance</w:t>
+      </w:r>
+      <w:r>
+        <w:t xml:space="preserve"> </w:t>
+      </w:r>
+      <w:r>
+        <w:t xml:space="preserve">remains at the SNP-only value, confirming that k-mer-based methods cannot</w:t>
+      </w:r>
+      <w:r>
+        <w:t xml:space="preserve"> </w:t>
+      </w:r>
+      <w:r>
+        <w:t xml:space="preserve">distinguish structural variation from point mutations.</w:t>
       </w:r>
     </w:p>
     <w:bookmarkEnd w:id="13"/>
@@ -1428,25 +1503,44 @@
         <w:pStyle w:val="FirstParagraph"/>
       </w:pPr>
       <w:r>
-        <w:t xml:space="preserve">The final Syn2b panel combines three Type IIB enzymes (BcgI, AlfI, BplI) with</w:t>
-      </w:r>
-      <w:r>
-        <w:t xml:space="preserve"> </w:t>
-      </w:r>
-      <w:r>
-        <w:t xml:space="preserve">the Type IIG enzyme CjePI. The optimization criterion is tag density: every</w:t>
-      </w:r>
-      <w:r>
-        <w:t xml:space="preserve"> </w:t>
-      </w:r>
-      <w:r>
-        <w:t xml:space="preserve">additional recognition site improves the resolution of inversions and indels</w:t>
-      </w:r>
-      <w:r>
-        <w:t xml:space="preserve"> </w:t>
-      </w:r>
-      <w:r>
-        <w:t xml:space="preserve">and reduces the sampling variance of length-weighted ratios.</w:t>
+        <w:t xml:space="preserve">The production Syn2b panel is</w:t>
+      </w:r>
+      <w:r>
+        <w:t xml:space="preserve"> </w:t>
+      </w:r>
+      <w:r>
+        <w:rPr>
+          <w:b/>
+          <w:bCs/>
+        </w:rPr>
+        <w:t xml:space="preserve">BcgI+AlfI+AloI+FalI</w:t>
+      </w:r>
+      <w:r>
+        <w:t xml:space="preserve">, chosen from the 16</w:t>
+      </w:r>
+      <w:r>
+        <w:t xml:space="preserve"> </w:t>
+      </w:r>
+      <w:r>
+        <w:t xml:space="preserve">Type IIB/IIG enzymes implemented in the Rust code by maximizing tag density</w:t>
+      </w:r>
+      <w:r>
+        <w:t xml:space="preserve"> </w:t>
+      </w:r>
+      <w:r>
+        <w:t xml:space="preserve">while limiting motif overlap. The optimization criterion is the junction-channel</w:t>
+      </w:r>
+      <w:r>
+        <w:t xml:space="preserve"> </w:t>
+      </w:r>
+      <w:r>
+        <w:t xml:space="preserve">resolution floor: additional landmarks improve the smallest detectable event</w:t>
+      </w:r>
+      <w:r>
+        <w:t xml:space="preserve"> </w:t>
+      </w:r>
+      <w:r>
+        <w:t xml:space="preserve">more than they improve the already-saturated orientation-channel correlation.</w:t>
       </w:r>
     </w:p>
     <w:p>
@@ -1458,7 +1552,7 @@
           <w:b/>
           <w:bCs/>
         </w:rPr>
-        <w:t xml:space="preserve">Single-enzyme performance.</w:t>
+        <w:t xml:space="preserve">Single-enzyme densities.</w:t>
       </w:r>
       <w:r>
         <w:t xml:space="preserve"> </w:t>
@@ -1480,43 +1574,19 @@
         <w:t xml:space="preserve"> </w:t>
       </w:r>
       <w:r>
-        <w:t xml:space="preserve">K-12, BcgI yields 2,877 tags</w:t>
-      </w:r>
-      <w:r>
-        <w:t xml:space="preserve"> </w:t>
-      </w:r>
-      <w:r>
-        <w:t xml:space="preserve">(0.63/kb), AlfI 1,939 (0.43/kb), BplI 383 (0.08/kb), and CjePI 9,284</w:t>
-      </w:r>
-      <w:r>
-        <w:t xml:space="preserve"> </w:t>
-      </w:r>
-      <w:r>
-        <w:t xml:space="preserve">(2.04/kb). In the prototype simulations, a 500-kb inversion produced the</w:t>
-      </w:r>
-      <w:r>
-        <w:t xml:space="preserve"> </w:t>
-      </w:r>
-      <w:r>
-        <w:t xml:space="preserve">largest breakpoint gain with CjePI and the smallest with BplI; a 10-kb indel</w:t>
-      </w:r>
-      <w:r>
-        <w:t xml:space="preserve"> </w:t>
-      </w:r>
-      <w:r>
-        <w:t xml:space="preserve">was detectable only with the dense CjePI layer (Figure 2, Table 2). BplI’s</w:t>
-      </w:r>
-      <w:r>
-        <w:t xml:space="preserve"> </w:t>
-      </w:r>
-      <w:r>
-        <w:t xml:space="preserve">lower density makes it the weakest single enzyme, while CjePI provides the</w:t>
-      </w:r>
-      <w:r>
-        <w:t xml:space="preserve"> </w:t>
-      </w:r>
-      <w:r>
-        <w:t xml:space="preserve">strongest single-enzyme signal.</w:t>
+        <w:t xml:space="preserve">K-12 (NC_000913.3, 4,641,652 bp),</w:t>
+      </w:r>
+      <w:r>
+        <w:t xml:space="preserve"> </w:t>
+      </w:r>
+      <w:r>
+        <w:t xml:space="preserve">BcgI yields 2,935 tags (0.63/kb), AlfI 2,023 (0.44/kb), AloI 523 (0.11/kb),</w:t>
+      </w:r>
+      <w:r>
+        <w:t xml:space="preserve"> </w:t>
+      </w:r>
+      <w:r>
+        <w:t xml:space="preserve">and FalI 735 (0.16/kb).</w:t>
       </w:r>
     </w:p>
     <w:p>
@@ -1528,37 +1598,25 @@
           <w:b/>
           <w:bCs/>
         </w:rPr>
-        <w:t xml:space="preserve">Multi-enzyme synergy.</w:t>
-      </w:r>
-      <w:r>
-        <w:t xml:space="preserve"> </w:t>
-      </w:r>
-      <w:r>
-        <w:t xml:space="preserve">Combining all four enzymes yields 14,483 tags</w:t>
-      </w:r>
-      <w:r>
-        <w:t xml:space="preserve"> </w:t>
-      </w:r>
-      <w:r>
-        <w:t xml:space="preserve">(3.19/kb), a 5.0× increase over BcgI alone. The prototype simulations show that</w:t>
-      </w:r>
-      <w:r>
-        <w:t xml:space="preserve"> </w:t>
-      </w:r>
-      <w:r>
-        <w:t xml:space="preserve">the combined panel amplifies both inversion and indel breakpoint signals beyond</w:t>
-      </w:r>
-      <w:r>
-        <w:t xml:space="preserve"> </w:t>
-      </w:r>
-      <w:r>
-        <w:t xml:space="preserve">any single enzyme. The total tag count is below the naive sum of the four</w:t>
-      </w:r>
-      <w:r>
-        <w:t xml:space="preserve"> </w:t>
-      </w:r>
-      <w:r>
-        <w:t xml:space="preserve">enzymes because recognition motifs occupy overlapping sequence space.</w:t>
+        <w:t xml:space="preserve">Multi-enzyme density.</w:t>
+      </w:r>
+      <w:r>
+        <w:t xml:space="preserve"> </w:t>
+      </w:r>
+      <w:r>
+        <w:t xml:space="preserve">Combining all four yields 6,216 tags (1.34/kb), a</w:t>
+      </w:r>
+      <w:r>
+        <w:t xml:space="preserve"> </w:t>
+      </w:r>
+      <w:r>
+        <w:t xml:space="preserve">2.1× increase over BcgI alone. The total is below the naive sum because</w:t>
+      </w:r>
+      <w:r>
+        <w:t xml:space="preserve"> </w:t>
+      </w:r>
+      <w:r>
+        <w:t xml:space="preserve">recognition motifs occupy overlapping sequence space.</w:t>
       </w:r>
     </w:p>
     <w:p>
@@ -1576,67 +1634,55 @@
         <w:t xml:space="preserve"> </w:t>
       </w:r>
       <w:r>
-        <w:t xml:space="preserve">BcgI and AlfI are standard Type IIB enzymes with</w:t>
-      </w:r>
-      <w:r>
-        <w:t xml:space="preserve"> </w:t>
-      </w:r>
-      <w:r>
-        <w:t xml:space="preserve">well-characterized 32-bp tags. BplI adds a 27-bp arm with sparser, longer tags.</w:t>
-      </w:r>
-      <w:r>
-        <w:t xml:space="preserve"> </w:t>
-      </w:r>
-      <w:r>
-        <w:t xml:space="preserve">CjePI is a Type IIG enzyme that recognizes the shorter CCYGA motif and produces</w:t>
-      </w:r>
-      <w:r>
-        <w:t xml:space="preserve"> </w:t>
-      </w:r>
-      <w:r>
-        <w:t xml:space="preserve">a ~3.3× denser tag layer than BcgI; this layer is essential for detecting small</w:t>
-      </w:r>
-      <w:r>
-        <w:t xml:space="preserve"> </w:t>
-      </w:r>
-      <w:r>
-        <w:t xml:space="preserve">indels and fine-scale inversions that the Type IIB enzymes miss. The panel was</w:t>
-      </w:r>
-      <w:r>
-        <w:t xml:space="preserve"> </w:t>
-      </w:r>
-      <w:r>
-        <w:t xml:space="preserve">chosen to maximize tag density while using enzymes with experimentally</w:t>
-      </w:r>
-      <w:r>
-        <w:t xml:space="preserve"> </w:t>
-      </w:r>
-      <w:r>
-        <w:t xml:space="preserve">validated recognition specificities. In practice, recognition sites can be</w:t>
-      </w:r>
-      <w:r>
-        <w:t xml:space="preserve"> </w:t>
-      </w:r>
-      <w:r>
-        <w:t xml:space="preserve">affected by DNA methylation and by sequence polymorphism within the motif;</w:t>
-      </w:r>
-      <w:r>
-        <w:t xml:space="preserve"> </w:t>
-      </w:r>
-      <w:r>
-        <w:t xml:space="preserve">however, because Syn2b reports length-weighted ratios over many landmarks, the</w:t>
-      </w:r>
-      <w:r>
-        <w:t xml:space="preserve"> </w:t>
-      </w:r>
-      <w:r>
-        <w:t xml:space="preserve">metric is robust to the occasional missing or extra site (Supplementary Note</w:t>
-      </w:r>
-      <w:r>
-        <w:t xml:space="preserve"> </w:t>
-      </w:r>
-      <w:r>
-        <w:t xml:space="preserve">2).</w:t>
+        <w:t xml:space="preserve">BcgI and AlfI provide well-characterized 32-bp Type</w:t>
+      </w:r>
+      <w:r>
+        <w:t xml:space="preserve"> </w:t>
+      </w:r>
+      <w:r>
+        <w:t xml:space="preserve">IIB tags and together contribute the majority of landmarks. AloI and FalI add</w:t>
+      </w:r>
+      <w:r>
+        <w:t xml:space="preserve"> </w:t>
+      </w:r>
+      <w:r>
+        <w:t xml:space="preserve">27-bp Type IIB arms with complementary motifs that increase density without</w:t>
+      </w:r>
+      <w:r>
+        <w:t xml:space="preserve"> </w:t>
+      </w:r>
+      <w:r>
+        <w:t xml:space="preserve">redundancy. The panel was chosen to maximize shared landmark counts across</w:t>
+      </w:r>
+      <w:r>
+        <w:t xml:space="preserve"> </w:t>
+      </w:r>
+      <w:r>
+        <w:t xml:space="preserve">diverse prokaryotic genomes while using enzymes with experimentally validated</w:t>
+      </w:r>
+      <w:r>
+        <w:t xml:space="preserve"> </w:t>
+      </w:r>
+      <w:r>
+        <w:t xml:space="preserve">recognition specificities. In practice, recognition sites can be affected by</w:t>
+      </w:r>
+      <w:r>
+        <w:t xml:space="preserve"> </w:t>
+      </w:r>
+      <w:r>
+        <w:t xml:space="preserve">DNA methylation and by sequence polymorphism within the motif; however, because</w:t>
+      </w:r>
+      <w:r>
+        <w:t xml:space="preserve"> </w:t>
+      </w:r>
+      <w:r>
+        <w:t xml:space="preserve">Syn2b reports length-weighted ratios over many landmarks, the metric is robust</w:t>
+      </w:r>
+      <w:r>
+        <w:t xml:space="preserve"> </w:t>
+      </w:r>
+      <w:r>
+        <w:t xml:space="preserve">to the occasional missing or extra site (Supplementary Note 2).</w:t>
       </w:r>
     </w:p>
     <w:p>
@@ -1654,13 +1700,13 @@
         <w:t xml:space="preserve"> </w:t>
       </w:r>
       <w:r>
-        <w:t xml:space="preserve">On the 43,334 held-out pairs, the four-enzyme</w:t>
-      </w:r>
-      <w:r>
-        <w:t xml:space="preserve"> </w:t>
-      </w:r>
-      <w:r>
-        <w:t xml:space="preserve">panel substantially outperforms BcgI alone:</w:t>
+        <w:t xml:space="preserve">On the 43,334 held-out pairs, the four-enzyme panel</w:t>
+      </w:r>
+      <w:r>
+        <w:t xml:space="preserve"> </w:t>
+      </w:r>
+      <w:r>
+        <w:t xml:space="preserve">substantially outperforms BcgI alone:</w:t>
       </w:r>
     </w:p>
     <w:tbl>
@@ -1789,7 +1835,7 @@
                 <w:b/>
                 <w:bCs/>
               </w:rPr>
-              <w:t xml:space="preserve">4-enzyme panel</w:t>
+              <w:t xml:space="preserve">4-enzyme panel (BcgI+AlfI+AloI+FalI)</w:t>
             </w:r>
           </w:p>
         </w:tc>
@@ -1894,31 +1940,31 @@
         <w:t xml:space="preserve"> </w:t>
       </w:r>
       <w:r>
-        <w:t xml:space="preserve">and MAE = 0.0323. The enzyme panel is therefore a high-performing, biologically</w:t>
-      </w:r>
-      <w:r>
-        <w:t xml:space="preserve"> </w:t>
-      </w:r>
-      <w:r>
-        <w:t xml:space="preserve">motivated default rather than the absolute optimal density choice. We retain</w:t>
-      </w:r>
-      <w:r>
-        <w:t xml:space="preserve"> </w:t>
-      </w:r>
-      <w:r>
-        <w:t xml:space="preserve">enzyme landmarks because they are deterministic, interpretable, and avoid the</w:t>
-      </w:r>
-      <w:r>
-        <w:t xml:space="preserve"> </w:t>
-      </w:r>
-      <w:r>
-        <w:t xml:space="preserve">memory and runtime cost of the densest FracMinHash sketches, but the method</w:t>
-      </w:r>
-      <w:r>
-        <w:t xml:space="preserve"> </w:t>
-      </w:r>
-      <w:r>
-        <w:t xml:space="preserve">generalizes to any set of ordered landmarks.</w:t>
+        <w:t xml:space="preserve">and MAE = 0.0323. The enzyme panel is therefore a high-performing,</w:t>
+      </w:r>
+      <w:r>
+        <w:t xml:space="preserve"> </w:t>
+      </w:r>
+      <w:r>
+        <w:t xml:space="preserve">biologically motivated default rather than the absolute optimal density choice.</w:t>
+      </w:r>
+      <w:r>
+        <w:t xml:space="preserve"> </w:t>
+      </w:r>
+      <w:r>
+        <w:t xml:space="preserve">We retain enzyme landmarks because they are deterministic, interpretable, and</w:t>
+      </w:r>
+      <w:r>
+        <w:t xml:space="preserve"> </w:t>
+      </w:r>
+      <w:r>
+        <w:t xml:space="preserve">avoid the memory and runtime cost of the densest FracMinHash sketches, but the</w:t>
+      </w:r>
+      <w:r>
+        <w:t xml:space="preserve"> </w:t>
+      </w:r>
+      <w:r>
+        <w:t xml:space="preserve">method generalizes to any set of ordered landmarks.</w:t>
       </w:r>
     </w:p>
     <w:bookmarkEnd w:id="14"/>
@@ -3312,20 +3358,20 @@
         <w:pStyle w:val="FirstParagraph"/>
       </w:pPr>
       <w:r>
-        <w:t xml:space="preserve">We re-analysed four published SynTracker cohorts (2,926</w:t>
-      </w:r>
-      <w:r>
-        <w:t xml:space="preserve"> </w:t>
+        <w:t xml:space="preserve">We re-analysed four published SynTracker isolate cohorts (</w:t>
       </w:r>
       <w:r>
         <w:rPr>
           <w:i/>
           <w:iCs/>
         </w:rPr>
-        <w:t xml:space="preserve">H. pylori</w:t>
-      </w:r>
-      <w:r>
-        <w:t xml:space="preserve">, 253</w:t>
+        <w:t xml:space="preserve">E. coli</w:t>
+      </w:r>
+      <w:r>
+        <w:t xml:space="preserve"> </w:t>
+      </w:r>
+      <w:r>
+        <w:t xml:space="preserve">hypermutator, n = 253 pairs;</w:t>
       </w:r>
       <w:r>
         <w:t xml:space="preserve"> </w:t>
@@ -3335,13 +3381,31 @@
           <w:i/>
           <w:iCs/>
         </w:rPr>
-        <w:t xml:space="preserve">E.</w:t>
+        <w:t xml:space="preserve">H. pylori</w:t>
+      </w:r>
+      <w:r>
+        <w:t xml:space="preserve">, n = 2,926 pairs;</w:t>
+      </w:r>
+      <w:r>
+        <w:t xml:space="preserve"> </w:t>
       </w:r>
       <w:r>
         <w:rPr>
           <w:i/>
           <w:iCs/>
         </w:rPr>
+        <w:t xml:space="preserve">N. gonorrhoeae</w:t>
+      </w:r>
+      <w:r>
+        <w:t xml:space="preserve">,</w:t>
+      </w:r>
+      <w:r>
+        <w:t xml:space="preserve"> </w:t>
+      </w:r>
+      <w:r>
+        <w:t xml:space="preserve">n = 66 pairs;</w:t>
+      </w:r>
+      <w:r>
         <w:t xml:space="preserve"> </w:t>
       </w:r>
       <w:r>
@@ -3349,13 +3413,40 @@
           <w:i/>
           <w:iCs/>
         </w:rPr>
-        <w:t xml:space="preserve">coli</w:t>
-      </w:r>
-      <w:r>
-        <w:t xml:space="preserve"> </w:t>
-      </w:r>
-      <w:r>
-        <w:t xml:space="preserve">hypermutator, 190</w:t>
+        <w:t xml:space="preserve">S. rimosus</w:t>
+      </w:r>
+      <w:r>
+        <w:t xml:space="preserve">, n = 190 pairs) with skani ANI and Syn2b structural</w:t>
+      </w:r>
+      <w:r>
+        <w:t xml:space="preserve"> </w:t>
+      </w:r>
+      <w:r>
+        <w:t xml:space="preserve">metrics. Unlike Figure 3, which validates Syn2b against alignment-based inverted</w:t>
+      </w:r>
+      <w:r>
+        <w:t xml:space="preserve"> </w:t>
+      </w:r>
+      <w:r>
+        <w:t xml:space="preserve">fractions, this comparison asks whether Syn2b’s fast structural signal adds</w:t>
+      </w:r>
+      <w:r>
+        <w:t xml:space="preserve"> </w:t>
+      </w:r>
+      <w:r>
+        <w:t xml:space="preserve">information beyond a state-of-the-art ANI estimator.</w:t>
+      </w:r>
+    </w:p>
+    <w:p>
+      <w:pPr>
+        <w:pStyle w:val="BodyText"/>
+      </w:pPr>
+      <w:r>
+        <w:rPr>
+          <w:b/>
+          <w:bCs/>
+        </w:rPr>
+        <w:t xml:space="preserve">Species occupy distinct structural regimes.</w:t>
       </w:r>
       <w:r>
         <w:t xml:space="preserve"> </w:t>
@@ -3368,7 +3459,37 @@
         <w:t xml:space="preserve">S. rimosus</w:t>
       </w:r>
       <w:r>
-        <w:t xml:space="preserve">, and 66</w:t>
+        <w:t xml:space="preserve"> </w:t>
+      </w:r>
+      <w:r>
+        <w:t xml:space="preserve">pairs cluster at</w:t>
+      </w:r>
+      <w:r>
+        <w:t xml:space="preserve"> </w:t>
+      </w:r>
+      <w:r>
+        <w:t xml:space="preserve">very high ANI (&gt;99.5%) yet span the widest breakpoint range (median</w:t>
+      </w:r>
+      <w:r>
+        <w:t xml:space="preserve"> </w:t>
+      </w:r>
+      <w:r>
+        <w:rPr>
+          <w:rStyle w:val="VerbatimChar"/>
+        </w:rPr>
+        <w:t xml:space="preserve">breakpoint_count</w:t>
+      </w:r>
+      <w:r>
+        <w:t xml:space="preserve"> </w:t>
+      </w:r>
+      <w:r>
+        <w:t xml:space="preserve">= 10), showing that clonal sequence similarity does not</w:t>
+      </w:r>
+      <w:r>
+        <w:t xml:space="preserve"> </w:t>
+      </w:r>
+      <w:r>
+        <w:t xml:space="preserve">guarantee structural identity.</w:t>
       </w:r>
       <w:r>
         <w:t xml:space="preserve"> </w:t>
@@ -3378,49 +3499,25 @@
           <w:i/>
           <w:iCs/>
         </w:rPr>
-        <w:t xml:space="preserve">N. gonorrhoeae</w:t>
-      </w:r>
-      <w:r>
-        <w:t xml:space="preserve"> </w:t>
-      </w:r>
-      <w:r>
-        <w:t xml:space="preserve">isolate pairs)</w:t>
-      </w:r>
-      <w:r>
-        <w:t xml:space="preserve"> </w:t>
-      </w:r>
-      <w:r>
-        <w:t xml:space="preserve">with skani ANI and Syn2b structural metrics. Unlike Figure 3, which validates</w:t>
-      </w:r>
-      <w:r>
-        <w:t xml:space="preserve"> </w:t>
-      </w:r>
-      <w:r>
-        <w:t xml:space="preserve">Syn2b against alignment-based inverted fractions, this comparison asks whether</w:t>
-      </w:r>
-      <w:r>
-        <w:t xml:space="preserve"> </w:t>
-      </w:r>
-      <w:r>
-        <w:t xml:space="preserve">Syn2b’s fast structural signal adds information beyond a state-of-the-art ANI</w:t>
-      </w:r>
-      <w:r>
-        <w:t xml:space="preserve"> </w:t>
-      </w:r>
-      <w:r>
-        <w:t xml:space="preserve">estimator.</w:t>
-      </w:r>
-    </w:p>
-    <w:p>
-      <w:pPr>
-        <w:pStyle w:val="BodyText"/>
-      </w:pPr>
-      <w:r>
-        <w:rPr>
-          <w:b/>
-          <w:bCs/>
-        </w:rPr>
-        <w:t xml:space="preserve">Species occupy distinct structural regimes.</w:t>
+        <w:t xml:space="preserve">E. coli</w:t>
+      </w:r>
+      <w:r>
+        <w:t xml:space="preserve"> </w:t>
+      </w:r>
+      <w:r>
+        <w:t xml:space="preserve">hypermutator pairs sit at lower ANI</w:t>
+      </w:r>
+      <w:r>
+        <w:t xml:space="preserve"> </w:t>
+      </w:r>
+      <w:r>
+        <w:t xml:space="preserve">(94.5–96.5%) with low breakpoint counts (median = 0), consistent with a</w:t>
+      </w:r>
+      <w:r>
+        <w:t xml:space="preserve"> </w:t>
+      </w:r>
+      <w:r>
+        <w:t xml:space="preserve">population driven primarily by point mutation.</w:t>
       </w:r>
       <w:r>
         <w:t xml:space="preserve"> </w:t>
@@ -3430,25 +3527,13 @@
           <w:i/>
           <w:iCs/>
         </w:rPr>
-        <w:t xml:space="preserve">S. rimosus</w:t>
-      </w:r>
-      <w:r>
-        <w:t xml:space="preserve"> </w:t>
-      </w:r>
-      <w:r>
-        <w:t xml:space="preserve">pairs cluster at</w:t>
-      </w:r>
-      <w:r>
-        <w:t xml:space="preserve"> </w:t>
-      </w:r>
-      <w:r>
-        <w:t xml:space="preserve">very high ANI (&gt;99.5%) yet span the widest breakpoint range, showing that clonal</w:t>
-      </w:r>
-      <w:r>
-        <w:t xml:space="preserve"> </w:t>
-      </w:r>
-      <w:r>
-        <w:t xml:space="preserve">sequence similarity does not guarantee structural identity.</w:t>
+        <w:t xml:space="preserve">H. pylori</w:t>
+      </w:r>
+      <w:r>
+        <w:t xml:space="preserve"> </w:t>
+      </w:r>
+      <w:r>
+        <w:t xml:space="preserve">and</w:t>
       </w:r>
       <w:r>
         <w:t xml:space="preserve"> </w:t>
@@ -3458,35 +3543,67 @@
           <w:i/>
           <w:iCs/>
         </w:rPr>
-        <w:t xml:space="preserve">E. coli</w:t>
-      </w:r>
-      <w:r>
-        <w:t xml:space="preserve"> </w:t>
-      </w:r>
-      <w:r>
-        <w:t xml:space="preserve">hypermutator pairs sit at lower ANI (94.5–96.5%) with low breakpoint counts,</w:t>
-      </w:r>
-      <w:r>
-        <w:t xml:space="preserve"> </w:t>
-      </w:r>
-      <w:r>
-        <w:t xml:space="preserve">consistent with a population driven primarily by point mutation.</w:t>
-      </w:r>
-      <w:r>
-        <w:t xml:space="preserve"> </w:t>
-      </w:r>
-      <w:r>
-        <w:rPr>
+        <w:t xml:space="preserve">N. gonorrhoeae</w:t>
+      </w:r>
+      <w:r>
+        <w:t xml:space="preserve"> </w:t>
+      </w:r>
+      <w:r>
+        <w:t xml:space="preserve">occupy an intermediate regime in which ANI and breakpoints vary together but</w:t>
+      </w:r>
+      <w:r>
+        <w:t xml:space="preserve"> </w:t>
+      </w:r>
+      <w:r>
+        <w:t xml:space="preserve">with substantial scatter (Figure 4a–c).</w:t>
+      </w:r>
+    </w:p>
+    <w:p>
+      <w:pPr>
+        <w:pStyle w:val="BodyText"/>
+      </w:pPr>
+      <w:r>
+        <w:rPr>
+          <w:b/>
+          <w:bCs/>
+        </w:rPr>
+        <w:t xml:space="preserve">Within-host</w:t>
+      </w:r>
+      <w:r>
+        <w:rPr>
+          <w:b/>
+          <w:bCs/>
+        </w:rPr>
+        <w:t xml:space="preserve"> </w:t>
+      </w:r>
+      <w:r>
+        <w:rPr>
+          <w:b/>
+          <w:bCs/>
           <w:i/>
           <w:iCs/>
         </w:rPr>
         <w:t xml:space="preserve">H. pylori</w:t>
       </w:r>
       <w:r>
-        <w:t xml:space="preserve"> </w:t>
-      </w:r>
-      <w:r>
-        <w:t xml:space="preserve">and</w:t>
+        <w:rPr>
+          <w:b/>
+          <w:bCs/>
+        </w:rPr>
+        <w:t xml:space="preserve"> </w:t>
+      </w:r>
+      <w:r>
+        <w:rPr>
+          <w:b/>
+          <w:bCs/>
+        </w:rPr>
+        <w:t xml:space="preserve">structure.</w:t>
+      </w:r>
+      <w:r>
+        <w:t xml:space="preserve"> </w:t>
+      </w:r>
+      <w:r>
+        <w:t xml:space="preserve">Among the 2,926</w:t>
       </w:r>
       <w:r>
         <w:t xml:space="preserve"> </w:t>
@@ -3496,79 +3613,9 @@
           <w:i/>
           <w:iCs/>
         </w:rPr>
-        <w:t xml:space="preserve">N. gonorrhoeae</w:t>
-      </w:r>
-      <w:r>
-        <w:t xml:space="preserve"> </w:t>
-      </w:r>
-      <w:r>
-        <w:t xml:space="preserve">occupy an intermediate regime in which ANI and breakpoints vary</w:t>
-      </w:r>
-      <w:r>
-        <w:t xml:space="preserve"> </w:t>
-      </w:r>
-      <w:r>
-        <w:t xml:space="preserve">together but with substantial scatter (Figure 4a–c).</w:t>
-      </w:r>
-    </w:p>
-    <w:p>
-      <w:pPr>
-        <w:pStyle w:val="BodyText"/>
-      </w:pPr>
-      <w:r>
-        <w:rPr>
-          <w:b/>
-          <w:bCs/>
-        </w:rPr>
-        <w:t xml:space="preserve">Within-host</w:t>
-      </w:r>
-      <w:r>
-        <w:rPr>
-          <w:b/>
-          <w:bCs/>
-        </w:rPr>
-        <w:t xml:space="preserve"> </w:t>
-      </w:r>
-      <w:r>
-        <w:rPr>
-          <w:b/>
-          <w:bCs/>
-          <w:i/>
-          <w:iCs/>
-        </w:rPr>
         <w:t xml:space="preserve">H. pylori</w:t>
       </w:r>
       <w:r>
-        <w:rPr>
-          <w:b/>
-          <w:bCs/>
-        </w:rPr>
-        <w:t xml:space="preserve"> </w:t>
-      </w:r>
-      <w:r>
-        <w:rPr>
-          <w:b/>
-          <w:bCs/>
-        </w:rPr>
-        <w:t xml:space="preserve">structure.</w:t>
-      </w:r>
-      <w:r>
-        <w:t xml:space="preserve"> </w:t>
-      </w:r>
-      <w:r>
-        <w:t xml:space="preserve">Among the 2,926</w:t>
-      </w:r>
-      <w:r>
-        <w:t xml:space="preserve"> </w:t>
-      </w:r>
-      <w:r>
-        <w:rPr>
-          <w:i/>
-          <w:iCs/>
-        </w:rPr>
-        <w:t xml:space="preserve">H. pylori</w:t>
-      </w:r>
-      <w:r>
         <w:t xml:space="preserve"> </w:t>
       </w:r>
       <w:r>
@@ -3578,13 +3625,97 @@
         <w:t xml:space="preserve"> </w:t>
       </w:r>
       <w:r>
-        <w:t xml:space="preserve">were recovered from the same participant. Same-host pairs tend to have both high</w:t>
-      </w:r>
-      <w:r>
-        <w:t xml:space="preserve"> </w:t>
-      </w:r>
-      <w:r>
-        <w:t xml:space="preserve">ANI and low breakpoint counts, whereas between-host pairs show greater</w:t>
+        <w:t xml:space="preserve">were recovered from the same participant. Within-patient pairs showed very low</w:t>
+      </w:r>
+      <w:r>
+        <w:t xml:space="preserve"> </w:t>
+      </w:r>
+      <w:r>
+        <w:t xml:space="preserve">structural disruption (median</w:t>
+      </w:r>
+      <w:r>
+        <w:t xml:space="preserve"> </w:t>
+      </w:r>
+      <w:r>
+        <w:rPr>
+          <w:rStyle w:val="VerbatimChar"/>
+        </w:rPr>
+        <w:t xml:space="preserve">breakpoint_count</w:t>
+      </w:r>
+      <w:r>
+        <w:t xml:space="preserve"> </w:t>
+      </w:r>
+      <w:r>
+        <w:t xml:space="preserve">= 0, median SCJ distance =</w:t>
+      </w:r>
+      <w:r>
+        <w:t xml:space="preserve"> </w:t>
+      </w:r>
+      <w:r>
+        <w:t xml:space="preserve">11 bp, median</w:t>
+      </w:r>
+      <w:r>
+        <w:t xml:space="preserve"> </w:t>
+      </w:r>
+      <w:r>
+        <w:rPr>
+          <w:rStyle w:val="VerbatimChar"/>
+        </w:rPr>
+        <w:t xml:space="preserve">observable_fraction</w:t>
+      </w:r>
+      <w:r>
+        <w:t xml:space="preserve"> </w:t>
+      </w:r>
+      <w:r>
+        <w:t xml:space="preserve">= 0.995), whereas cross-patient pairs showed</w:t>
+      </w:r>
+      <w:r>
+        <w:t xml:space="preserve"> </w:t>
+      </w:r>
+      <w:r>
+        <w:t xml:space="preserve">substantially more signal (median</w:t>
+      </w:r>
+      <w:r>
+        <w:t xml:space="preserve"> </w:t>
+      </w:r>
+      <w:r>
+        <w:rPr>
+          <w:rStyle w:val="VerbatimChar"/>
+        </w:rPr>
+        <w:t xml:space="preserve">breakpoint_count</w:t>
+      </w:r>
+      <w:r>
+        <w:t xml:space="preserve"> </w:t>
+      </w:r>
+      <w:r>
+        <w:t xml:space="preserve">= 8, median SCJ distance =</w:t>
+      </w:r>
+      <w:r>
+        <w:t xml:space="preserve"> </w:t>
+      </w:r>
+      <w:r>
+        <w:t xml:space="preserve">37 bp, median</w:t>
+      </w:r>
+      <w:r>
+        <w:t xml:space="preserve"> </w:t>
+      </w:r>
+      <w:r>
+        <w:rPr>
+          <w:rStyle w:val="VerbatimChar"/>
+        </w:rPr>
+        <w:t xml:space="preserve">observable_fraction</w:t>
+      </w:r>
+      <w:r>
+        <w:t xml:space="preserve"> </w:t>
+      </w:r>
+      <w:r>
+        <w:t xml:space="preserve">= 0.978). Same-host pairs tend to have both</w:t>
+      </w:r>
+      <w:r>
+        <w:t xml:space="preserve"> </w:t>
+      </w:r>
+      <w:r>
+        <w:t xml:space="preserve">high ANI and low breakpoint counts, whereas between-host pairs show greater</w:t>
       </w:r>
       <w:r>
         <w:t xml:space="preserve"> </w:t>
@@ -3609,245 +3740,6 @@
       </w:r>
       <w:r>
         <w:t xml:space="preserve">tags.</w:t>
-      </w:r>
-    </w:p>
-    <w:p>
-      <w:pPr>
-        <w:pStyle w:val="BodyText"/>
-      </w:pPr>
-      <w:r>
-        <w:rPr>
-          <w:b/>
-          <w:bCs/>
-        </w:rPr>
-        <w:t xml:space="preserve">SynTracker isolate cohorts.</w:t>
-      </w:r>
-      <w:r>
-        <w:t xml:space="preserve"> </w:t>
-      </w:r>
-      <w:r>
-        <w:t xml:space="preserve">We re-analysed the four isolate cohorts</w:t>
-      </w:r>
-      <w:r>
-        <w:t xml:space="preserve"> </w:t>
-      </w:r>
-      <w:r>
-        <w:t xml:space="preserve">reported by SynTracker (</w:t>
-      </w:r>
-      <w:r>
-        <w:rPr>
-          <w:i/>
-          <w:iCs/>
-        </w:rPr>
-        <w:t xml:space="preserve">E. coli</w:t>
-      </w:r>
-      <w:r>
-        <w:t xml:space="preserve"> </w:t>
-      </w:r>
-      <w:r>
-        <w:t xml:space="preserve">hypermutator, n = 253 pairs;</w:t>
-      </w:r>
-      <w:r>
-        <w:t xml:space="preserve"> </w:t>
-      </w:r>
-      <w:r>
-        <w:rPr>
-          <w:i/>
-          <w:iCs/>
-        </w:rPr>
-        <w:t xml:space="preserve">H. pylori</w:t>
-      </w:r>
-      <w:r>
-        <w:t xml:space="preserve">,</w:t>
-      </w:r>
-      <w:r>
-        <w:t xml:space="preserve"> </w:t>
-      </w:r>
-      <w:r>
-        <w:t xml:space="preserve">n = 2,926 pairs;</w:t>
-      </w:r>
-      <w:r>
-        <w:t xml:space="preserve"> </w:t>
-      </w:r>
-      <w:r>
-        <w:rPr>
-          <w:i/>
-          <w:iCs/>
-        </w:rPr>
-        <w:t xml:space="preserve">N. gonorrhoeae</w:t>
-      </w:r>
-      <w:r>
-        <w:t xml:space="preserve">, n = 66 pairs;</w:t>
-      </w:r>
-      <w:r>
-        <w:t xml:space="preserve"> </w:t>
-      </w:r>
-      <w:r>
-        <w:rPr>
-          <w:i/>
-          <w:iCs/>
-        </w:rPr>
-        <w:t xml:space="preserve">S. rimosus</w:t>
-      </w:r>
-      <w:r>
-        <w:t xml:space="preserve">, n = 190 pairs)</w:t>
-      </w:r>
-      <w:r>
-        <w:t xml:space="preserve"> </w:t>
-      </w:r>
-      <w:r>
-        <w:t xml:space="preserve">with Syn2b. For</w:t>
-      </w:r>
-      <w:r>
-        <w:t xml:space="preserve"> </w:t>
-      </w:r>
-      <w:r>
-        <w:rPr>
-          <w:i/>
-          <w:iCs/>
-        </w:rPr>
-        <w:t xml:space="preserve">H. pylori</w:t>
-      </w:r>
-      <w:r>
-        <w:t xml:space="preserve">, 476 pairs were derived from the same patient.</w:t>
-      </w:r>
-      <w:r>
-        <w:t xml:space="preserve"> </w:t>
-      </w:r>
-      <w:r>
-        <w:t xml:space="preserve">Within-patient pairs showed very low structural disruption (median</w:t>
-      </w:r>
-      <w:r>
-        <w:t xml:space="preserve"> </w:t>
-      </w:r>
-      <w:r>
-        <w:rPr>
-          <w:rStyle w:val="VerbatimChar"/>
-        </w:rPr>
-        <w:t xml:space="preserve">breakpoint_count</w:t>
-      </w:r>
-      <w:r>
-        <w:t xml:space="preserve"> </w:t>
-      </w:r>
-      <w:r>
-        <w:t xml:space="preserve">= 0, median SCJ distance = 11 bp, median</w:t>
-      </w:r>
-      <w:r>
-        <w:t xml:space="preserve"> </w:t>
-      </w:r>
-      <w:r>
-        <w:rPr>
-          <w:rStyle w:val="VerbatimChar"/>
-        </w:rPr>
-        <w:t xml:space="preserve">observable_fraction</w:t>
-      </w:r>
-      <w:r>
-        <w:t xml:space="preserve"> </w:t>
-      </w:r>
-      <w:r>
-        <w:t xml:space="preserve">= 0.995), whereas cross-patient pairs showed substantially</w:t>
-      </w:r>
-      <w:r>
-        <w:t xml:space="preserve"> </w:t>
-      </w:r>
-      <w:r>
-        <w:t xml:space="preserve">more signal (median</w:t>
-      </w:r>
-      <w:r>
-        <w:t xml:space="preserve"> </w:t>
-      </w:r>
-      <w:r>
-        <w:rPr>
-          <w:rStyle w:val="VerbatimChar"/>
-        </w:rPr>
-        <w:t xml:space="preserve">breakpoint_count</w:t>
-      </w:r>
-      <w:r>
-        <w:t xml:space="preserve"> </w:t>
-      </w:r>
-      <w:r>
-        <w:t xml:space="preserve">= 8, median SCJ distance = 37 bp, median</w:t>
-      </w:r>
-      <w:r>
-        <w:t xml:space="preserve"> </w:t>
-      </w:r>
-      <w:r>
-        <w:rPr>
-          <w:rStyle w:val="VerbatimChar"/>
-        </w:rPr>
-        <w:t xml:space="preserve">observable_fraction</w:t>
-      </w:r>
-      <w:r>
-        <w:t xml:space="preserve"> </w:t>
-      </w:r>
-      <w:r>
-        <w:t xml:space="preserve">= 0.978). The other three cohorts lacked within-host</w:t>
-      </w:r>
-      <w:r>
-        <w:t xml:space="preserve"> </w:t>
-      </w:r>
-      <w:r>
-        <w:t xml:space="preserve">replicates in the released data, but cross-pair median</w:t>
-      </w:r>
-      <w:r>
-        <w:t xml:space="preserve"> </w:t>
-      </w:r>
-      <w:r>
-        <w:rPr>
-          <w:rStyle w:val="VerbatimChar"/>
-        </w:rPr>
-        <w:t xml:space="preserve">breakpoint_count</w:t>
-      </w:r>
-      <w:r>
-        <w:t xml:space="preserve"> </w:t>
-      </w:r>
-      <w:r>
-        <w:t xml:space="preserve">was</w:t>
-      </w:r>
-      <w:r>
-        <w:t xml:space="preserve"> </w:t>
-      </w:r>
-      <w:r>
-        <w:t xml:space="preserve">0 (</w:t>
-      </w:r>
-      <w:r>
-        <w:rPr>
-          <w:i/>
-          <w:iCs/>
-        </w:rPr>
-        <w:t xml:space="preserve">E. coli</w:t>
-      </w:r>
-      <w:r>
-        <w:t xml:space="preserve"> </w:t>
-      </w:r>
-      <w:r>
-        <w:t xml:space="preserve">hypermutator), 3 (</w:t>
-      </w:r>
-      <w:r>
-        <w:rPr>
-          <w:i/>
-          <w:iCs/>
-        </w:rPr>
-        <w:t xml:space="preserve">N. gonorrhoeae</w:t>
-      </w:r>
-      <w:r>
-        <w:t xml:space="preserve">), and 10 (</w:t>
-      </w:r>
-      <w:r>
-        <w:rPr>
-          <w:i/>
-          <w:iCs/>
-        </w:rPr>
-        <w:t xml:space="preserve">S. rimosus</w:t>
-      </w:r>
-      <w:r>
-        <w:t xml:space="preserve">),</w:t>
-      </w:r>
-      <w:r>
-        <w:t xml:space="preserve"> </w:t>
-      </w:r>
-      <w:r>
-        <w:t xml:space="preserve">consistent with the simulated evolutionary regimes above.</w:t>
       </w:r>
     </w:p>
     <w:bookmarkEnd w:id="16"/>
@@ -4127,25 +4019,25 @@
         <w:t xml:space="preserve"> </w:t>
       </w:r>
       <w:r>
-        <w:t xml:space="preserve">CjePI’s high density enables detection of 10-kb indels, while multi-enzyme</w:t>
-      </w:r>
-      <w:r>
-        <w:t xml:space="preserve"> </w:t>
-      </w:r>
-      <w:r>
-        <w:t xml:space="preserve">panels provide the highest resolution. For very closely related strains, even</w:t>
-      </w:r>
-      <w:r>
-        <w:t xml:space="preserve"> </w:t>
-      </w:r>
-      <w:r>
-        <w:t xml:space="preserve">single Type IIB enzymes suffice because shared landmark counts are high; for</w:t>
-      </w:r>
-      <w:r>
-        <w:t xml:space="preserve"> </w:t>
-      </w:r>
-      <w:r>
-        <w:t xml:space="preserve">divergent pairs or small SV detection, dense panels are preferable.</w:t>
+        <w:t xml:space="preserve">The BcgI+AlfI+AloI+FalI panel raises landmark density enough to detect ~4-kb</w:t>
+      </w:r>
+      <w:r>
+        <w:t xml:space="preserve"> </w:t>
+      </w:r>
+      <w:r>
+        <w:t xml:space="preserve">events, while BcgI alone is limited to ~8-kb events. For very closely related</w:t>
+      </w:r>
+      <w:r>
+        <w:t xml:space="preserve"> </w:t>
+      </w:r>
+      <w:r>
+        <w:t xml:space="preserve">strains, even single Type IIB enzymes suffice because shared landmark counts are</w:t>
+      </w:r>
+      <w:r>
+        <w:t xml:space="preserve"> </w:t>
+      </w:r>
+      <w:r>
+        <w:t xml:space="preserve">high; for divergent pairs or small SV detection, dense panels are preferable.</w:t>
       </w:r>
     </w:p>
     <w:p>
@@ -4289,13 +4181,13 @@
       </w:r>
     </w:p>
     <w:bookmarkEnd w:id="20"/>
-    <w:bookmarkStart w:id="21" w:name="type-iibiig-enzyme-digestion"/>
+    <w:bookmarkStart w:id="21" w:name="type-iib-enzyme-digestion"/>
     <w:p>
       <w:pPr>
         <w:pStyle w:val="Heading3"/>
       </w:pPr>
       <w:r>
-        <w:t xml:space="preserve">Type IIB/IIG enzyme digestion</w:t>
+        <w:t xml:space="preserve">Type IIB enzyme digestion</w:t>
       </w:r>
     </w:p>
     <w:p>
@@ -4303,6 +4195,27 @@
         <w:pStyle w:val="FirstParagraph"/>
       </w:pPr>
       <w:r>
+        <w:t xml:space="preserve">The production panel used for all GTDB-R207 validation is</w:t>
+      </w:r>
+      <w:r>
+        <w:t xml:space="preserve"> </w:t>
+      </w:r>
+      <w:r>
+        <w:rPr>
+          <w:b/>
+          <w:bCs/>
+        </w:rPr>
+        <w:t xml:space="preserve">BcgI+AlfI+AloI+FalI</w:t>
+      </w:r>
+      <w:r>
+        <w:t xml:space="preserve">.</w:t>
+      </w:r>
+    </w:p>
+    <w:p>
+      <w:pPr>
+        <w:pStyle w:val="BodyText"/>
+      </w:pPr>
+      <w:r>
         <w:rPr>
           <w:b/>
           <w:bCs/>
@@ -4349,13 +4262,19 @@
           <w:b/>
           <w:bCs/>
         </w:rPr>
-        <w:t xml:space="preserve">BplI</w:t>
-      </w:r>
-      <w:r>
-        <w:t xml:space="preserve"> </w:t>
-      </w:r>
-      <w:r>
-        <w:t xml:space="preserve">(27-bp tag): offset 8=GAG, offset 16=CTC.</w:t>
+        <w:t xml:space="preserve">AloI</w:t>
+      </w:r>
+      <w:r>
+        <w:t xml:space="preserve"> </w:t>
+      </w:r>
+      <w:r>
+        <w:t xml:space="preserve">(27-bp tag): forward strand offset 7=GAAC, offset 17=TCC; reverse</w:t>
+      </w:r>
+      <w:r>
+        <w:t xml:space="preserve"> </w:t>
+      </w:r>
+      <w:r>
+        <w:t xml:space="preserve">strand offset 7=GGA, offset 16=GTTC.</w:t>
       </w:r>
     </w:p>
     <w:p>
@@ -4367,13 +4286,13 @@
           <w:b/>
           <w:bCs/>
         </w:rPr>
-        <w:t xml:space="preserve">CjePI</w:t>
-      </w:r>
-      <w:r>
-        <w:t xml:space="preserve"> </w:t>
-      </w:r>
-      <w:r>
-        <w:t xml:space="preserve">(32-bp tag): recognition motif CCYGA (Y=C or T) at offset 10.</w:t>
+        <w:t xml:space="preserve">FalI</w:t>
+      </w:r>
+      <w:r>
+        <w:t xml:space="preserve"> </w:t>
+      </w:r>
+      <w:r>
+        <w:t xml:space="preserve">(27-bp tag): offset 8=AAG, offset 16=CTT (palindromic).</w:t>
       </w:r>
     </w:p>
     <w:bookmarkEnd w:id="21"/>
@@ -4608,7 +4527,7 @@
         <w:t xml:space="preserve"> </w:t>
       </w:r>
       <w:r>
-        <w:t xml:space="preserve">counts. Syn2b was run with the BcgI+AlfI+BplI+CjePI multi-enzyme panel,</w:t>
+        <w:t xml:space="preserve">counts. Syn2b was run with the BcgI+AlfI+AloI+FalI multi-enzyme panel,</w:t>
       </w:r>
       <w:r>
         <w:t xml:space="preserve"> </w:t>
@@ -5724,31 +5643,31 @@
         <w:t xml:space="preserve"> </w:t>
       </w:r>
       <w:r>
-        <w:t xml:space="preserve">(a) Type IIB/IIG enzyme recognition produces</w:t>
-      </w:r>
-      <w:r>
-        <w:t xml:space="preserve"> </w:t>
-      </w:r>
-      <w:r>
-        <w:t xml:space="preserve">27–32 bp tags flanking the motif. (b) An inversion reverses the order and</w:t>
-      </w:r>
-      <w:r>
-        <w:t xml:space="preserve"> </w:t>
-      </w:r>
-      <w:r>
-        <w:t xml:space="preserve">orientation of tags inside the affected segment. (c) Length-weighted ratios are</w:t>
-      </w:r>
-      <w:r>
-        <w:t xml:space="preserve"> </w:t>
-      </w:r>
-      <w:r>
-        <w:t xml:space="preserve">invariant to assembly fragmentation, whereas transition counts acquire a bias</w:t>
-      </w:r>
-      <w:r>
-        <w:t xml:space="preserve"> </w:t>
-      </w:r>
-      <w:r>
-        <w:t xml:space="preserve">that grows with the number of fragments K.</w:t>
+        <w:t xml:space="preserve">(a) Type IIB enzyme recognition produces 27–32</w:t>
+      </w:r>
+      <w:r>
+        <w:t xml:space="preserve"> </w:t>
+      </w:r>
+      <w:r>
+        <w:t xml:space="preserve">bp tags flanking the motif. (b) An inversion reverses the order and orientation</w:t>
+      </w:r>
+      <w:r>
+        <w:t xml:space="preserve"> </w:t>
+      </w:r>
+      <w:r>
+        <w:t xml:space="preserve">of tags inside the affected segment. (c) Length-weighted ratios are invariant to</w:t>
+      </w:r>
+      <w:r>
+        <w:t xml:space="preserve"> </w:t>
+      </w:r>
+      <w:r>
+        <w:t xml:space="preserve">assembly fragmentation, whereas transition counts acquire a bias that grows with</w:t>
+      </w:r>
+      <w:r>
+        <w:t xml:space="preserve"> </w:t>
+      </w:r>
+      <w:r>
+        <w:t xml:space="preserve">the number of fragments K.</w:t>
       </w:r>
     </w:p>
     <w:p>
@@ -5766,7 +5685,7 @@
         <w:t xml:space="preserve"> </w:t>
       </w:r>
       <w:r>
-        <w:t xml:space="preserve">In-silico prototype simulations on</w:t>
+        <w:t xml:space="preserve">Controlled</w:t>
       </w:r>
       <w:r>
         <w:t xml:space="preserve"> </w:t>
@@ -5782,49 +5701,49 @@
         <w:t xml:space="preserve"> </w:t>
       </w:r>
       <w:r>
-        <w:t xml:space="preserve">K-12 with 1% SNPs plus a single</w:t>
-      </w:r>
-      <w:r>
-        <w:t xml:space="preserve"> </w:t>
-      </w:r>
-      <w:r>
-        <w:t xml:space="preserve">structural variant. Breakpoint counts are illustrative estimates from the</w:t>
-      </w:r>
-      <w:r>
-        <w:t xml:space="preserve"> </w:t>
-      </w:r>
-      <w:r>
-        <w:t xml:space="preserve">Python prototype; quantitative validation on real genomes is shown in Figure 3.</w:t>
-      </w:r>
-      <w:r>
-        <w:t xml:space="preserve"> </w:t>
-      </w:r>
-      <w:r>
-        <w:t xml:space="preserve">(a) Breakpoint counts across enzymes for control and four SV types. (b)</w:t>
-      </w:r>
-      <w:r>
-        <w:t xml:space="preserve"> </w:t>
-      </w:r>
-      <w:r>
-        <w:t xml:space="preserve">Global order disruption measured by Kendall tau. (c) Mash proxy distance is</w:t>
-      </w:r>
-      <w:r>
-        <w:t xml:space="preserve"> </w:t>
-      </w:r>
-      <w:r>
-        <w:t xml:space="preserve">unchanged by structural variation. (d) 10-kb insertion and deletion sensitivity.</w:t>
-      </w:r>
-      <w:r>
-        <w:t xml:space="preserve"> </w:t>
-      </w:r>
-      <w:r>
-        <w:t xml:space="preserve">(e) Tag density (bars, left axis) drives the inversion breakpoint signal</w:t>
-      </w:r>
-      <w:r>
-        <w:t xml:space="preserve"> </w:t>
-      </w:r>
-      <w:r>
-        <w:t xml:space="preserve">(line, right axis). (f) Local adjacency Jaccard.</w:t>
+        <w:t xml:space="preserve">K-12 genomes generated with the Rust Syn2b implementation.</w:t>
+      </w:r>
+      <w:r>
+        <w:t xml:space="preserve"> </w:t>
+      </w:r>
+      <w:r>
+        <w:t xml:space="preserve">Substitutions outside recognition sites produce zero junctions; a single</w:t>
+      </w:r>
+      <w:r>
+        <w:t xml:space="preserve"> </w:t>
+      </w:r>
+      <w:r>
+        <w:t xml:space="preserve">inversion produces two junctions; a single translocation produces three</w:t>
+      </w:r>
+      <w:r>
+        <w:t xml:space="preserve"> </w:t>
+      </w:r>
+      <w:r>
+        <w:t xml:space="preserve">junctions; a 10-kb insertion or deletion is recovered when landmark density</w:t>
+      </w:r>
+      <w:r>
+        <w:t xml:space="preserve"> </w:t>
+      </w:r>
+      <w:r>
+        <w:t xml:space="preserve">places tags on both sides of the event. Mash distance remains at the SNP-only</w:t>
+      </w:r>
+      <w:r>
+        <w:t xml:space="preserve"> </w:t>
+      </w:r>
+      <w:r>
+        <w:t xml:space="preserve">value under all structural variants, confirming that k-mer methods cannot</w:t>
+      </w:r>
+      <w:r>
+        <w:t xml:space="preserve"> </w:t>
+      </w:r>
+      <w:r>
+        <w:t xml:space="preserve">distinguish SV from point mutation. Quantitative validation on real genomes is</w:t>
+      </w:r>
+      <w:r>
+        <w:t xml:space="preserve"> </w:t>
+      </w:r>
+      <w:r>
+        <w:t xml:space="preserve">shown in Figure 3.</w:t>
       </w:r>
     </w:p>
     <w:p>
@@ -6106,7 +6025,7 @@
           <w:b/>
           <w:bCs/>
         </w:rPr>
-        <w:t xml:space="preserve">Table 1. Enzyme tag densities and structural-variation sensitivity in</w:t>
+        <w:t xml:space="preserve">Table 1. Enzyme tag densities in</w:t>
       </w:r>
       <w:r>
         <w:rPr>
@@ -6136,7 +6055,7 @@
           <w:b/>
           <w:bCs/>
         </w:rPr>
-        <w:t xml:space="preserve">K-12 (Python prototype).</w:t>
+        <w:t xml:space="preserve">K-12 (NC_000913.3, 4,641,652 bp).</w:t>
       </w:r>
     </w:p>
     <w:p>
@@ -6144,13 +6063,356 @@
         <w:pStyle w:val="BodyText"/>
       </w:pPr>
       <w:r>
-        <w:t xml:space="preserve">Tag counts are deterministic in-silico counts; breakpoint deltas are prototype</w:t>
-      </w:r>
-      <w:r>
-        <w:t xml:space="preserve"> </w:t>
-      </w:r>
-      <w:r>
-        <w:t xml:space="preserve">estimates for qualitative comparison.</w:t>
+        <w:t xml:space="preserve">Tag counts are deterministic in-silico counts from the Rust implementation.</w:t>
+      </w:r>
+      <w:r>
+        <w:t xml:space="preserve"> </w:t>
+      </w:r>
+      <w:r>
+        <w:t xml:space="preserve">The production panel is BcgI+AlfI+AloI+FalI.</w:t>
+      </w:r>
+    </w:p>
+    <w:tbl>
+      <w:tblPr>
+        <w:tblStyle w:val="Table"/>
+        <w:tblW w:type="auto" w:w="0"/>
+        <w:tblLook w:firstRow="1" w:lastRow="0" w:firstColumn="0" w:lastColumn="0" w:noHBand="0" w:noVBand="0" w:val="0020"/>
+      </w:tblPr>
+      <w:tblGrid>
+        <w:gridCol w:w="2640"/>
+        <w:gridCol w:w="2640"/>
+        <w:gridCol w:w="2640"/>
+      </w:tblGrid>
+      <w:tr>
+        <w:trPr>
+          <w:tblHeader w:val="on"/>
+        </w:trPr>
+        <w:tc>
+          <w:tcPr/>
+          <w:p>
+            <w:pPr>
+              <w:pStyle w:val="Compact"/>
+            </w:pPr>
+            <w:r>
+              <w:t xml:space="preserve">enzyme</w:t>
+            </w:r>
+          </w:p>
+        </w:tc>
+        <w:tc>
+          <w:tcPr/>
+          <w:p>
+            <w:pPr>
+              <w:pStyle w:val="Compact"/>
+              <w:jc w:val="right"/>
+            </w:pPr>
+            <w:r>
+              <w:t xml:space="preserve">tag count</w:t>
+            </w:r>
+          </w:p>
+        </w:tc>
+        <w:tc>
+          <w:tcPr/>
+          <w:p>
+            <w:pPr>
+              <w:pStyle w:val="Compact"/>
+              <w:jc w:val="right"/>
+            </w:pPr>
+            <w:r>
+              <w:t xml:space="preserve">density (/kb)</w:t>
+            </w:r>
+          </w:p>
+        </w:tc>
+      </w:tr>
+      <w:tr>
+        <w:tc>
+          <w:tcPr/>
+          <w:p>
+            <w:pPr>
+              <w:pStyle w:val="Compact"/>
+            </w:pPr>
+            <w:r>
+              <w:t xml:space="preserve">BcgI</w:t>
+            </w:r>
+          </w:p>
+        </w:tc>
+        <w:tc>
+          <w:tcPr/>
+          <w:p>
+            <w:pPr>
+              <w:pStyle w:val="Compact"/>
+              <w:jc w:val="right"/>
+            </w:pPr>
+            <w:r>
+              <w:t xml:space="preserve">2,935</w:t>
+            </w:r>
+          </w:p>
+        </w:tc>
+        <w:tc>
+          <w:tcPr/>
+          <w:p>
+            <w:pPr>
+              <w:pStyle w:val="Compact"/>
+              <w:jc w:val="right"/>
+            </w:pPr>
+            <w:r>
+              <w:t xml:space="preserve">0.632</w:t>
+            </w:r>
+          </w:p>
+        </w:tc>
+      </w:tr>
+      <w:tr>
+        <w:tc>
+          <w:tcPr/>
+          <w:p>
+            <w:pPr>
+              <w:pStyle w:val="Compact"/>
+            </w:pPr>
+            <w:r>
+              <w:t xml:space="preserve">AlfI</w:t>
+            </w:r>
+          </w:p>
+        </w:tc>
+        <w:tc>
+          <w:tcPr/>
+          <w:p>
+            <w:pPr>
+              <w:pStyle w:val="Compact"/>
+              <w:jc w:val="right"/>
+            </w:pPr>
+            <w:r>
+              <w:t xml:space="preserve">2,023</w:t>
+            </w:r>
+          </w:p>
+        </w:tc>
+        <w:tc>
+          <w:tcPr/>
+          <w:p>
+            <w:pPr>
+              <w:pStyle w:val="Compact"/>
+              <w:jc w:val="right"/>
+            </w:pPr>
+            <w:r>
+              <w:t xml:space="preserve">0.436</w:t>
+            </w:r>
+          </w:p>
+        </w:tc>
+      </w:tr>
+      <w:tr>
+        <w:tc>
+          <w:tcPr/>
+          <w:p>
+            <w:pPr>
+              <w:pStyle w:val="Compact"/>
+            </w:pPr>
+            <w:r>
+              <w:t xml:space="preserve">AloI</w:t>
+            </w:r>
+          </w:p>
+        </w:tc>
+        <w:tc>
+          <w:tcPr/>
+          <w:p>
+            <w:pPr>
+              <w:pStyle w:val="Compact"/>
+              <w:jc w:val="right"/>
+            </w:pPr>
+            <w:r>
+              <w:t xml:space="preserve">523</w:t>
+            </w:r>
+          </w:p>
+        </w:tc>
+        <w:tc>
+          <w:tcPr/>
+          <w:p>
+            <w:pPr>
+              <w:pStyle w:val="Compact"/>
+              <w:jc w:val="right"/>
+            </w:pPr>
+            <w:r>
+              <w:t xml:space="preserve">0.113</w:t>
+            </w:r>
+          </w:p>
+        </w:tc>
+      </w:tr>
+      <w:tr>
+        <w:tc>
+          <w:tcPr/>
+          <w:p>
+            <w:pPr>
+              <w:pStyle w:val="Compact"/>
+            </w:pPr>
+            <w:r>
+              <w:t xml:space="preserve">FalI</w:t>
+            </w:r>
+          </w:p>
+        </w:tc>
+        <w:tc>
+          <w:tcPr/>
+          <w:p>
+            <w:pPr>
+              <w:pStyle w:val="Compact"/>
+              <w:jc w:val="right"/>
+            </w:pPr>
+            <w:r>
+              <w:t xml:space="preserve">735</w:t>
+            </w:r>
+          </w:p>
+        </w:tc>
+        <w:tc>
+          <w:tcPr/>
+          <w:p>
+            <w:pPr>
+              <w:pStyle w:val="Compact"/>
+              <w:jc w:val="right"/>
+            </w:pPr>
+            <w:r>
+              <w:t xml:space="preserve">0.158</w:t>
+            </w:r>
+          </w:p>
+        </w:tc>
+      </w:tr>
+      <w:tr>
+        <w:tc>
+          <w:tcPr/>
+          <w:p>
+            <w:pPr>
+              <w:pStyle w:val="Compact"/>
+            </w:pPr>
+            <w:r>
+              <w:rPr>
+                <w:b/>
+                <w:bCs/>
+              </w:rPr>
+              <w:t xml:space="preserve">BcgI+AlfI+AloI+FalI</w:t>
+            </w:r>
+          </w:p>
+        </w:tc>
+        <w:tc>
+          <w:tcPr/>
+          <w:p>
+            <w:pPr>
+              <w:pStyle w:val="Compact"/>
+              <w:jc w:val="right"/>
+            </w:pPr>
+            <w:r>
+              <w:rPr>
+                <w:b/>
+                <w:bCs/>
+              </w:rPr>
+              <w:t xml:space="preserve">6,216</w:t>
+            </w:r>
+          </w:p>
+        </w:tc>
+        <w:tc>
+          <w:tcPr/>
+          <w:p>
+            <w:pPr>
+              <w:pStyle w:val="Compact"/>
+              <w:jc w:val="right"/>
+            </w:pPr>
+            <w:r>
+              <w:rPr>
+                <w:b/>
+                <w:bCs/>
+              </w:rPr>
+              <w:t xml:space="preserve">1.339</w:t>
+            </w:r>
+          </w:p>
+        </w:tc>
+      </w:tr>
+    </w:tbl>
+    <w:p>
+      <w:pPr>
+        <w:pStyle w:val="BodyText"/>
+      </w:pPr>
+      <w:r>
+        <w:rPr>
+          <w:b/>
+          <w:bCs/>
+        </w:rPr>
+        <w:t xml:space="preserve">Table 2. SV detection metrics across enzymes and SV types.</w:t>
+      </w:r>
+    </w:p>
+    <w:p>
+      <w:pPr>
+        <w:pStyle w:val="BodyText"/>
+      </w:pPr>
+      <w:r>
+        <w:rPr>
+          <w:b/>
+          <w:bCs/>
+        </w:rPr>
+        <w:t xml:space="preserve">Table 3. GTDB-R207 validation: correlation of Syn2b metrics with dnadiff by</w:t>
+      </w:r>
+      <w:r>
+        <w:rPr>
+          <w:b/>
+          <w:bCs/>
+        </w:rPr>
+        <w:t xml:space="preserve"> </w:t>
+      </w:r>
+      <w:r>
+        <w:rPr>
+          <w:b/>
+          <w:bCs/>
+        </w:rPr>
+        <w:t xml:space="preserve">ANI band.</w:t>
+      </w:r>
+    </w:p>
+    <w:p>
+      <w:pPr>
+        <w:pStyle w:val="BodyText"/>
+      </w:pPr>
+      <w:r>
+        <w:rPr>
+          <w:b/>
+          <w:bCs/>
+        </w:rPr>
+        <w:t xml:space="preserve">Table 4. Runtime and scaling of Syn2b structural comparison.</w:t>
+      </w:r>
+    </w:p>
+    <w:p>
+      <w:pPr>
+        <w:pStyle w:val="BodyText"/>
+      </w:pPr>
+      <w:r>
+        <w:t xml:space="preserve">The</w:t>
+      </w:r>
+      <w:r>
+        <w:t xml:space="preserve"> </w:t>
+      </w:r>
+      <w:r>
+        <w:t xml:space="preserve">“n pairs (raw)”</w:t>
+      </w:r>
+      <w:r>
+        <w:t xml:space="preserve"> </w:t>
+      </w:r>
+      <w:r>
+        <w:t xml:space="preserve">column includes self-comparisons and both directional</w:t>
+      </w:r>
+      <w:r>
+        <w:t xml:space="preserve"> </w:t>
+      </w:r>
+      <w:r>
+        <w:t xml:space="preserve">comparisons as recorded by the benchmark;</w:t>
+      </w:r>
+      <w:r>
+        <w:t xml:space="preserve"> </w:t>
+      </w:r>
+      <w:r>
+        <w:t xml:space="preserve">“n unique pairs”</w:t>
+      </w:r>
+      <w:r>
+        <w:t xml:space="preserve"> </w:t>
+      </w:r>
+      <w:r>
+        <w:t xml:space="preserve">is the number of</w:t>
+      </w:r>
+      <w:r>
+        <w:t xml:space="preserve"> </w:t>
+      </w:r>
+      <w:r>
+        <w:t xml:space="preserve">unordered genome pairs used for the per-pair estimate.</w:t>
       </w:r>
     </w:p>
     <w:tbl>
@@ -6178,484 +6440,6 @@
               <w:pStyle w:val="Compact"/>
             </w:pPr>
             <w:r>
-              <w:t xml:space="preserve">enzyme</w:t>
-            </w:r>
-          </w:p>
-        </w:tc>
-        <w:tc>
-          <w:tcPr/>
-          <w:p>
-            <w:pPr>
-              <w:pStyle w:val="Compact"/>
-              <w:jc w:val="right"/>
-            </w:pPr>
-            <w:r>
-              <w:t xml:space="preserve">tag count</w:t>
-            </w:r>
-          </w:p>
-        </w:tc>
-        <w:tc>
-          <w:tcPr/>
-          <w:p>
-            <w:pPr>
-              <w:pStyle w:val="Compact"/>
-              <w:jc w:val="right"/>
-            </w:pPr>
-            <w:r>
-              <w:t xml:space="preserve">density (/kb)</w:t>
-            </w:r>
-          </w:p>
-        </w:tc>
-        <w:tc>
-          <w:tcPr/>
-          <w:p>
-            <w:pPr>
-              <w:pStyle w:val="Compact"/>
-              <w:jc w:val="right"/>
-            </w:pPr>
-            <w:r>
-              <w:t xml:space="preserve">inversion 500 kb Δbreakpoints</w:t>
-            </w:r>
-          </w:p>
-        </w:tc>
-        <w:tc>
-          <w:tcPr/>
-          <w:p>
-            <w:pPr>
-              <w:pStyle w:val="Compact"/>
-              <w:jc w:val="right"/>
-            </w:pPr>
-            <w:r>
-              <w:t xml:space="preserve">insertion 10 kb Δbreakpoints</w:t>
-            </w:r>
-          </w:p>
-        </w:tc>
-      </w:tr>
-      <w:tr>
-        <w:tc>
-          <w:tcPr/>
-          <w:p>
-            <w:pPr>
-              <w:pStyle w:val="Compact"/>
-            </w:pPr>
-            <w:r>
-              <w:t xml:space="preserve">BcgI</w:t>
-            </w:r>
-          </w:p>
-        </w:tc>
-        <w:tc>
-          <w:tcPr/>
-          <w:p>
-            <w:pPr>
-              <w:pStyle w:val="Compact"/>
-              <w:jc w:val="right"/>
-            </w:pPr>
-            <w:r>
-              <w:t xml:space="preserve">2,877</w:t>
-            </w:r>
-          </w:p>
-        </w:tc>
-        <w:tc>
-          <w:tcPr/>
-          <w:p>
-            <w:pPr>
-              <w:pStyle w:val="Compact"/>
-              <w:jc w:val="right"/>
-            </w:pPr>
-            <w:r>
-              <w:t xml:space="preserve">0.63</w:t>
-            </w:r>
-          </w:p>
-        </w:tc>
-        <w:tc>
-          <w:tcPr/>
-          <w:p>
-            <w:pPr>
-              <w:pStyle w:val="Compact"/>
-              <w:jc w:val="right"/>
-            </w:pPr>
-            <w:r>
-              <w:t xml:space="preserve">+646</w:t>
-            </w:r>
-          </w:p>
-        </w:tc>
-        <w:tc>
-          <w:tcPr/>
-          <w:p>
-            <w:pPr>
-              <w:pStyle w:val="Compact"/>
-              <w:jc w:val="right"/>
-            </w:pPr>
-            <w:r>
-              <w:t xml:space="preserve">+5</w:t>
-            </w:r>
-          </w:p>
-        </w:tc>
-      </w:tr>
-      <w:tr>
-        <w:tc>
-          <w:tcPr/>
-          <w:p>
-            <w:pPr>
-              <w:pStyle w:val="Compact"/>
-            </w:pPr>
-            <w:r>
-              <w:t xml:space="preserve">AlfI</w:t>
-            </w:r>
-          </w:p>
-        </w:tc>
-        <w:tc>
-          <w:tcPr/>
-          <w:p>
-            <w:pPr>
-              <w:pStyle w:val="Compact"/>
-              <w:jc w:val="right"/>
-            </w:pPr>
-            <w:r>
-              <w:t xml:space="preserve">1,939</w:t>
-            </w:r>
-          </w:p>
-        </w:tc>
-        <w:tc>
-          <w:tcPr/>
-          <w:p>
-            <w:pPr>
-              <w:pStyle w:val="Compact"/>
-              <w:jc w:val="right"/>
-            </w:pPr>
-            <w:r>
-              <w:t xml:space="preserve">0.43</w:t>
-            </w:r>
-          </w:p>
-        </w:tc>
-        <w:tc>
-          <w:tcPr/>
-          <w:p>
-            <w:pPr>
-              <w:pStyle w:val="Compact"/>
-              <w:jc w:val="right"/>
-            </w:pPr>
-            <w:r>
-              <w:t xml:space="preserve">+484</w:t>
-            </w:r>
-          </w:p>
-        </w:tc>
-        <w:tc>
-          <w:tcPr/>
-          <w:p>
-            <w:pPr>
-              <w:pStyle w:val="Compact"/>
-              <w:jc w:val="right"/>
-            </w:pPr>
-            <w:r>
-              <w:t xml:space="preserve">+4</w:t>
-            </w:r>
-          </w:p>
-        </w:tc>
-      </w:tr>
-      <w:tr>
-        <w:tc>
-          <w:tcPr/>
-          <w:p>
-            <w:pPr>
-              <w:pStyle w:val="Compact"/>
-            </w:pPr>
-            <w:r>
-              <w:t xml:space="preserve">BplI</w:t>
-            </w:r>
-          </w:p>
-        </w:tc>
-        <w:tc>
-          <w:tcPr/>
-          <w:p>
-            <w:pPr>
-              <w:pStyle w:val="Compact"/>
-              <w:jc w:val="right"/>
-            </w:pPr>
-            <w:r>
-              <w:t xml:space="preserve">383</w:t>
-            </w:r>
-          </w:p>
-        </w:tc>
-        <w:tc>
-          <w:tcPr/>
-          <w:p>
-            <w:pPr>
-              <w:pStyle w:val="Compact"/>
-              <w:jc w:val="right"/>
-            </w:pPr>
-            <w:r>
-              <w:t xml:space="preserve">0.08</w:t>
-            </w:r>
-          </w:p>
-        </w:tc>
-        <w:tc>
-          <w:tcPr/>
-          <w:p>
-            <w:pPr>
-              <w:pStyle w:val="Compact"/>
-              <w:jc w:val="right"/>
-            </w:pPr>
-            <w:r>
-              <w:t xml:space="preserve">+64</w:t>
-            </w:r>
-          </w:p>
-        </w:tc>
-        <w:tc>
-          <w:tcPr/>
-          <w:p>
-            <w:pPr>
-              <w:pStyle w:val="Compact"/>
-              <w:jc w:val="right"/>
-            </w:pPr>
-            <w:r>
-              <w:t xml:space="preserve">+3</w:t>
-            </w:r>
-          </w:p>
-        </w:tc>
-      </w:tr>
-      <w:tr>
-        <w:tc>
-          <w:tcPr/>
-          <w:p>
-            <w:pPr>
-              <w:pStyle w:val="Compact"/>
-            </w:pPr>
-            <w:r>
-              <w:t xml:space="preserve">CjePI</w:t>
-            </w:r>
-          </w:p>
-        </w:tc>
-        <w:tc>
-          <w:tcPr/>
-          <w:p>
-            <w:pPr>
-              <w:pStyle w:val="Compact"/>
-              <w:jc w:val="right"/>
-            </w:pPr>
-            <w:r>
-              <w:t xml:space="preserve">9,284</w:t>
-            </w:r>
-          </w:p>
-        </w:tc>
-        <w:tc>
-          <w:tcPr/>
-          <w:p>
-            <w:pPr>
-              <w:pStyle w:val="Compact"/>
-              <w:jc w:val="right"/>
-            </w:pPr>
-            <w:r>
-              <w:t xml:space="preserve">2.04</w:t>
-            </w:r>
-          </w:p>
-        </w:tc>
-        <w:tc>
-          <w:tcPr/>
-          <w:p>
-            <w:pPr>
-              <w:pStyle w:val="Compact"/>
-              <w:jc w:val="right"/>
-            </w:pPr>
-            <w:r>
-              <w:t xml:space="preserve">+2,018</w:t>
-            </w:r>
-          </w:p>
-        </w:tc>
-        <w:tc>
-          <w:tcPr/>
-          <w:p>
-            <w:pPr>
-              <w:pStyle w:val="Compact"/>
-              <w:jc w:val="right"/>
-            </w:pPr>
-            <w:r>
-              <w:t xml:space="preserve">+23</w:t>
-            </w:r>
-          </w:p>
-        </w:tc>
-      </w:tr>
-      <w:tr>
-        <w:tc>
-          <w:tcPr/>
-          <w:p>
-            <w:pPr>
-              <w:pStyle w:val="Compact"/>
-            </w:pPr>
-            <w:r>
-              <w:t xml:space="preserve">BcgI+AlfI+BplI+CjePI</w:t>
-            </w:r>
-          </w:p>
-        </w:tc>
-        <w:tc>
-          <w:tcPr/>
-          <w:p>
-            <w:pPr>
-              <w:pStyle w:val="Compact"/>
-              <w:jc w:val="right"/>
-            </w:pPr>
-            <w:r>
-              <w:t xml:space="preserve">14,483</w:t>
-            </w:r>
-          </w:p>
-        </w:tc>
-        <w:tc>
-          <w:tcPr/>
-          <w:p>
-            <w:pPr>
-              <w:pStyle w:val="Compact"/>
-              <w:jc w:val="right"/>
-            </w:pPr>
-            <w:r>
-              <w:t xml:space="preserve">3.19</w:t>
-            </w:r>
-          </w:p>
-        </w:tc>
-        <w:tc>
-          <w:tcPr/>
-          <w:p>
-            <w:pPr>
-              <w:pStyle w:val="Compact"/>
-              <w:jc w:val="right"/>
-            </w:pPr>
-            <w:r>
-              <w:t xml:space="preserve">+3,201</w:t>
-            </w:r>
-          </w:p>
-        </w:tc>
-        <w:tc>
-          <w:tcPr/>
-          <w:p>
-            <w:pPr>
-              <w:pStyle w:val="Compact"/>
-              <w:jc w:val="right"/>
-            </w:pPr>
-            <w:r>
-              <w:t xml:space="preserve">+29</w:t>
-            </w:r>
-          </w:p>
-        </w:tc>
-      </w:tr>
-    </w:tbl>
-    <w:p>
-      <w:pPr>
-        <w:pStyle w:val="BodyText"/>
-      </w:pPr>
-      <w:r>
-        <w:rPr>
-          <w:b/>
-          <w:bCs/>
-        </w:rPr>
-        <w:t xml:space="preserve">Table 2. SV detection metrics across enzymes and SV types.</w:t>
-      </w:r>
-    </w:p>
-    <w:p>
-      <w:pPr>
-        <w:pStyle w:val="BodyText"/>
-      </w:pPr>
-      <w:r>
-        <w:rPr>
-          <w:b/>
-          <w:bCs/>
-        </w:rPr>
-        <w:t xml:space="preserve">Table 3. GTDB-R207 validation: correlation of Syn2b metrics with dnadiff by</w:t>
-      </w:r>
-      <w:r>
-        <w:rPr>
-          <w:b/>
-          <w:bCs/>
-        </w:rPr>
-        <w:t xml:space="preserve"> </w:t>
-      </w:r>
-      <w:r>
-        <w:rPr>
-          <w:b/>
-          <w:bCs/>
-        </w:rPr>
-        <w:t xml:space="preserve">ANI band.</w:t>
-      </w:r>
-    </w:p>
-    <w:p>
-      <w:pPr>
-        <w:pStyle w:val="BodyText"/>
-      </w:pPr>
-      <w:r>
-        <w:rPr>
-          <w:b/>
-          <w:bCs/>
-        </w:rPr>
-        <w:t xml:space="preserve">Table 4. Runtime and scaling of Syn2b structural comparison.</w:t>
-      </w:r>
-    </w:p>
-    <w:p>
-      <w:pPr>
-        <w:pStyle w:val="BodyText"/>
-      </w:pPr>
-      <w:r>
-        <w:t xml:space="preserve">The</w:t>
-      </w:r>
-      <w:r>
-        <w:t xml:space="preserve"> </w:t>
-      </w:r>
-      <w:r>
-        <w:t xml:space="preserve">“n pairs (raw)”</w:t>
-      </w:r>
-      <w:r>
-        <w:t xml:space="preserve"> </w:t>
-      </w:r>
-      <w:r>
-        <w:t xml:space="preserve">column includes self-comparisons and both directional</w:t>
-      </w:r>
-      <w:r>
-        <w:t xml:space="preserve"> </w:t>
-      </w:r>
-      <w:r>
-        <w:t xml:space="preserve">comparisons as recorded by the benchmark;</w:t>
-      </w:r>
-      <w:r>
-        <w:t xml:space="preserve"> </w:t>
-      </w:r>
-      <w:r>
-        <w:t xml:space="preserve">“n unique pairs”</w:t>
-      </w:r>
-      <w:r>
-        <w:t xml:space="preserve"> </w:t>
-      </w:r>
-      <w:r>
-        <w:t xml:space="preserve">is the number of</w:t>
-      </w:r>
-      <w:r>
-        <w:t xml:space="preserve"> </w:t>
-      </w:r>
-      <w:r>
-        <w:t xml:space="preserve">unordered genome pairs used for the per-pair estimate.</w:t>
-      </w:r>
-    </w:p>
-    <w:tbl>
-      <w:tblPr>
-        <w:tblStyle w:val="Table"/>
-        <w:tblW w:type="pct" w:w="5000"/>
-        <w:tblLayout w:type="fixed"/>
-        <w:tblLook w:firstRow="1" w:lastRow="0" w:firstColumn="0" w:lastColumn="0" w:noHBand="0" w:noVBand="0" w:val="0020"/>
-      </w:tblPr>
-      <w:tblGrid>
-        <w:gridCol w:w="1250"/>
-        <w:gridCol w:w="1667"/>
-        <w:gridCol w:w="1667"/>
-        <w:gridCol w:w="1667"/>
-        <w:gridCol w:w="1667"/>
-      </w:tblGrid>
-      <w:tr>
-        <w:trPr>
-          <w:tblHeader w:val="on"/>
-        </w:trPr>
-        <w:tc>
-          <w:tcPr/>
-          <w:p>
-            <w:pPr>
-              <w:pStyle w:val="Compact"/>
-            </w:pPr>
-            <w:r>
               <w:t xml:space="preserve">n genomes</w:t>
             </w:r>
           </w:p>
@@ -7057,7 +6841,7 @@
         <w:t xml:space="preserve"> </w:t>
       </w:r>
       <w:r>
-        <w:t xml:space="preserve">Supplementary Note 2: Error model for</w:t>
+        <w:t xml:space="preserve">Supplementary Note 2: Error model and per-pair standard errors for</w:t>
       </w:r>
       <w:r>
         <w:t xml:space="preserve"> </w:t>
@@ -7075,25 +6859,19 @@
         <w:t xml:space="preserve"> </w:t>
       </w:r>
       <w:r>
-        <w:t xml:space="preserve">Supplementary Table 1: Raw simulation data (</w:t>
+        <w:t xml:space="preserve">Supplementary Table 1: GTDB-R207 per-pair structural metrics</w:t>
+      </w:r>
+      <w:r>
+        <w:t xml:space="preserve"> </w:t>
+      </w:r>
+      <w:r>
+        <w:t xml:space="preserve">(</w:t>
       </w:r>
       <w:r>
         <w:rPr>
           <w:rStyle w:val="VerbatimChar"/>
         </w:rPr>
-        <w:t xml:space="preserve">data/enzyme_comparison.csv</w:t>
-      </w:r>
-      <w:r>
-        <w:t xml:space="preserve">,</w:t>
-      </w:r>
-      <w:r>
-        <w:t xml:space="preserve"> </w:t>
-      </w:r>
-      <w:r>
-        <w:rPr>
-          <w:rStyle w:val="VerbatimChar"/>
-        </w:rPr>
-        <w:t xml:space="preserve">data/multi_enzyme_results.csv</w:t>
+        <w:t xml:space="preserve">results/gtdb50k/inverted_fraction_truth_four.tsv</w:t>
       </w:r>
       <w:r>
         <w:t xml:space="preserve">).</w:t>
@@ -7102,34 +6880,13 @@
         <w:t xml:space="preserve"> </w:t>
       </w:r>
       <w:r>
-        <w:t xml:space="preserve">Supplementary Table 2: GTDB-R207 per-pair structural metrics</w:t>
-      </w:r>
-      <w:r>
-        <w:t xml:space="preserve"> </w:t>
-      </w:r>
-      <w:r>
-        <w:t xml:space="preserve">(</w:t>
-      </w:r>
-      <w:r>
-        <w:rPr>
-          <w:rStyle w:val="VerbatimChar"/>
-        </w:rPr>
-        <w:t xml:space="preserve">results/gtdb50k/inverted_fraction_truth_four.tsv</w:t>
-      </w:r>
-      <w:r>
-        <w:t xml:space="preserve">).</w:t>
-      </w:r>
-      <w:r>
-        <w:t xml:space="preserve"> </w:t>
-      </w:r>
-      <w:r>
-        <w:t xml:space="preserve">Supplementary Table 3: Runtime comparison with alignment-based methods.</w:t>
-      </w:r>
-      <w:r>
-        <w:t xml:space="preserve"> </w:t>
-      </w:r>
-      <w:r>
-        <w:t xml:space="preserve">Supplementary Figure 1: Tag spacing distributions.</w:t>
+        <w:t xml:space="preserve">Supplementary Table 2: Runtime comparison with alignment-based methods.</w:t>
+      </w:r>
+      <w:r>
+        <w:t xml:space="preserve"> </w:t>
+      </w:r>
+      <w:r>
+        <w:t xml:space="preserve">Supplementary Figure 1: Tag spacing distributions for the production panel.</w:t>
       </w:r>
       <w:r>
         <w:t xml:space="preserve"> </w:t>

</xml_diff>

<commit_message>
Regenerate Figure 2 with Rust Syn2b on controlled SV genomes; update caption and manuscript
</commit_message>
<xml_diff>
--- a/Syn2b_Manuscript.docx
+++ b/Syn2b_Manuscript.docx
@@ -5701,49 +5701,67 @@
         <w:t xml:space="preserve"> </w:t>
       </w:r>
       <w:r>
-        <w:t xml:space="preserve">K-12 genomes generated with the Rust Syn2b implementation.</w:t>
-      </w:r>
-      <w:r>
-        <w:t xml:space="preserve"> </w:t>
-      </w:r>
-      <w:r>
-        <w:t xml:space="preserve">Substitutions outside recognition sites produce zero junctions; a single</w:t>
-      </w:r>
-      <w:r>
-        <w:t xml:space="preserve"> </w:t>
-      </w:r>
-      <w:r>
-        <w:t xml:space="preserve">inversion produces two junctions; a single translocation produces three</w:t>
-      </w:r>
-      <w:r>
-        <w:t xml:space="preserve"> </w:t>
-      </w:r>
-      <w:r>
-        <w:t xml:space="preserve">junctions; a 10-kb insertion or deletion is recovered when landmark density</w:t>
-      </w:r>
-      <w:r>
-        <w:t xml:space="preserve"> </w:t>
-      </w:r>
-      <w:r>
-        <w:t xml:space="preserve">places tags on both sides of the event. Mash distance remains at the SNP-only</w:t>
-      </w:r>
-      <w:r>
-        <w:t xml:space="preserve"> </w:t>
-      </w:r>
-      <w:r>
-        <w:t xml:space="preserve">value under all structural variants, confirming that k-mer methods cannot</w:t>
-      </w:r>
-      <w:r>
-        <w:t xml:space="preserve"> </w:t>
-      </w:r>
-      <w:r>
-        <w:t xml:space="preserve">distinguish SV from point mutation. Quantitative validation on real genomes is</w:t>
-      </w:r>
-      <w:r>
-        <w:t xml:space="preserve"> </w:t>
-      </w:r>
-      <w:r>
-        <w:t xml:space="preserve">shown in Figure 3.</w:t>
+        <w:t xml:space="preserve">K-12 genomes generated with the Rust Syn2b implementation</w:t>
+      </w:r>
+      <w:r>
+        <w:t xml:space="preserve"> </w:t>
+      </w:r>
+      <w:r>
+        <w:t xml:space="preserve">and the production four-enzyme panel (BcgI, AlfI, AloI, FalI). The SNP-only</w:t>
+      </w:r>
+      <w:r>
+        <w:t xml:space="preserve"> </w:t>
+      </w:r>
+      <w:r>
+        <w:t xml:space="preserve">control carries 1% random substitutions outside recognition sites and produces</w:t>
+      </w:r>
+      <w:r>
+        <w:t xml:space="preserve"> </w:t>
+      </w:r>
+      <w:r>
+        <w:t xml:space="preserve">zero junctions; a single 100-kb or 500-kb inversion produces two junctions; a</w:t>
+      </w:r>
+      <w:r>
+        <w:t xml:space="preserve"> </w:t>
+      </w:r>
+      <w:r>
+        <w:t xml:space="preserve">single 500-kb translocation produces three junctions. The length-weighted raw</w:t>
+      </w:r>
+      <w:r>
+        <w:t xml:space="preserve"> </w:t>
+      </w:r>
+      <w:r>
+        <w:t xml:space="preserve">inverted fraction scales with inverted segment size. Small insertions and</w:t>
+      </w:r>
+      <w:r>
+        <w:t xml:space="preserve"> </w:t>
+      </w:r>
+      <w:r>
+        <w:t xml:space="preserve">deletions are not shown here because breakpoint counts depend on whether tags</w:t>
+      </w:r>
+      <w:r>
+        <w:t xml:space="preserve"> </w:t>
+      </w:r>
+      <w:r>
+        <w:t xml:space="preserve">straddle the breakpoint (Supplementary Figure 3). Mash distance (k=21) reports</w:t>
+      </w:r>
+      <w:r>
+        <w:t xml:space="preserve"> </w:t>
+      </w:r>
+      <w:r>
+        <w:t xml:space="preserve">no additional signal under any structural variant, confirming that k-mer methods</w:t>
+      </w:r>
+      <w:r>
+        <w:t xml:space="preserve"> </w:t>
+      </w:r>
+      <w:r>
+        <w:t xml:space="preserve">cannot distinguish SV from point mutation. Quantitative validation on real</w:t>
+      </w:r>
+      <w:r>
+        <w:t xml:space="preserve"> </w:t>
+      </w:r>
+      <w:r>
+        <w:t xml:space="preserve">isolates is shown in Figure 3.</w:t>
       </w:r>
     </w:p>
     <w:p>

</xml_diff>

<commit_message>
Add Supplementary Figure 3: SV size sensitivity with Rust Syn2b; update caption
</commit_message>
<xml_diff>
--- a/Syn2b_Manuscript.docx
+++ b/Syn2b_Manuscript.docx
@@ -6916,7 +6916,23 @@
         <w:t xml:space="preserve"> </w:t>
       </w:r>
       <w:r>
-        <w:t xml:space="preserve">Supplementary Figure 3: Sensitivity analysis with varying SV sizes.</w:t>
+        <w:t xml:space="preserve">Supplementary Figure 3: Sensitivity of Syn2b junction counts and raw inverted fraction to SV size. Controlled</w:t>
+      </w:r>
+      <w:r>
+        <w:t xml:space="preserve"> </w:t>
+      </w:r>
+      <w:r>
+        <w:rPr>
+          <w:i/>
+          <w:iCs/>
+        </w:rPr>
+        <w:t xml:space="preserve">E. coli</w:t>
+      </w:r>
+      <w:r>
+        <w:t xml:space="preserve"> </w:t>
+      </w:r>
+      <w:r>
+        <w:t xml:space="preserve">K-12 variants carrying a single inversion, insertion, deletion, or translocation on a 1% SNP background were analysed with the four-enzyme panel. Inversions yield two junctions irrespective of size, while the inverted fraction increases with inverted segment length. Insertions and deletions produce zero junctions unless a landmark straddles the breakpoint; translocation of a 500-kb segment yields three junctions.</w:t>
       </w:r>
     </w:p>
     <w:p>

</xml_diff>

<commit_message>
Add Supplementary Figures 1 and 2: tag spacing and closed-genome validation; update captions
</commit_message>
<xml_diff>
--- a/Syn2b_Manuscript.docx
+++ b/Syn2b_Manuscript.docx
@@ -6904,13 +6904,44 @@
         <w:t xml:space="preserve"> </w:t>
       </w:r>
       <w:r>
-        <w:t xml:space="preserve">Supplementary Figure 1: Tag spacing distributions for the production panel.</w:t>
-      </w:r>
-      <w:r>
-        <w:t xml:space="preserve"> </w:t>
-      </w:r>
-      <w:r>
-        <w:t xml:space="preserve">Supplementary Figure 2: Closed-genome inversion validation.</w:t>
+        <w:t xml:space="preserve">Supplementary Figure 1: Tag spacing distribution for the production four-enzyme panel in</w:t>
+      </w:r>
+      <w:r>
+        <w:t xml:space="preserve"> </w:t>
+      </w:r>
+      <w:r>
+        <w:rPr>
+          <w:i/>
+          <w:iCs/>
+        </w:rPr>
+        <w:t xml:space="preserve">E. coli</w:t>
+      </w:r>
+      <w:r>
+        <w:t xml:space="preserve"> </w:t>
+      </w:r>
+      <w:r>
+        <w:t xml:space="preserve">K-12. Inter-tag distances were extracted from the TGT output of</w:t>
+      </w:r>
+      <w:r>
+        <w:t xml:space="preserve"> </w:t>
+      </w:r>
+      <w:r>
+        <w:rPr>
+          <w:rStyle w:val="VerbatimChar"/>
+        </w:rPr>
+        <w:t xml:space="preserve">syn2b digest</w:t>
+      </w:r>
+      <w:r>
+        <w:t xml:space="preserve"> </w:t>
+      </w:r>
+      <w:r>
+        <w:t xml:space="preserve">(n = 6,215 intervals). Median spacing is 1,533 bp and mean spacing is 2,980 bp.</w:t>
+      </w:r>
+      <w:r>
+        <w:t xml:space="preserve"> </w:t>
+      </w:r>
+      <w:r>
+        <w:t xml:space="preserve">Supplementary Figure 2: Closed-genome inversion validation on 100 complete-genome pairs selected for high expected structural divergence. (a) Number of junctions reported by Syn2b versus dnadiff. (b) Fraction of dnadiff junctions that match a Syn2b junction. (c) Median distance between matched Syn2b and dnadiff junction positions. The low recovery and coarse position resolution reflect that many dnadiff inversions fall in regions without a nearby restriction-enzyme landmark.</w:t>
       </w:r>
       <w:r>
         <w:t xml:space="preserve"> </w:t>

</xml_diff>

<commit_message>
Add Supplementary Notes 1-2, Table 3, and reorganise supplementary section
</commit_message>
<xml_diff>
--- a/Syn2b_Manuscript.docx
+++ b/Syn2b_Manuscript.docx
@@ -2,7 +2,7 @@
 <file path=word/document.xml><?xml version="1.0" encoding="utf-8"?>
 <w:document xmlns:w="http://schemas.openxmlformats.org/wordprocessingml/2006/main" xmlns:m="http://schemas.openxmlformats.org/officeDocument/2006/math" xmlns:r="http://schemas.openxmlformats.org/officeDocument/2006/relationships" xmlns:o="urn:schemas-microsoft-com:office:office" xmlns:v="urn:schemas-microsoft-com:vml" xmlns:w10="urn:schemas-microsoft-com:office:word" xmlns:a="http://schemas.openxmlformats.org/drawingml/2006/main" xmlns:pic="http://schemas.openxmlformats.org/drawingml/2006/picture" xmlns:wp="http://schemas.openxmlformats.org/drawingml/2006/wordprocessingDrawing">
   <w:body>
-    <w:bookmarkStart w:id="33" w:name="Xfb3261d548fe8da6bb34f2e4f574f27e44ec4ad"/>
+    <w:bookmarkStart w:id="36" w:name="Xfb3261d548fe8da6bb34f2e4f574f27e44ec4ad"/>
     <w:p>
       <w:pPr>
         <w:pStyle w:val="Heading1"/>
@@ -6839,7 +6839,7 @@
       </w:r>
     </w:p>
     <w:bookmarkEnd w:id="28"/>
-    <w:bookmarkStart w:id="29" w:name="supplementary-information"/>
+    <w:bookmarkStart w:id="32" w:name="supplementary-information"/>
     <w:p>
       <w:pPr>
         <w:pStyle w:val="Heading2"/>
@@ -6848,38 +6848,83 @@
         <w:t xml:space="preserve">Supplementary Information</w:t>
       </w:r>
     </w:p>
-    <w:p>
-      <w:pPr>
-        <w:pStyle w:val="FirstParagraph"/>
-      </w:pPr>
-      <w:r>
-        <w:t xml:space="preserve">Supplementary Note 1: Mathematical derivation of the fragmentation principle.</w:t>
-      </w:r>
-      <w:r>
-        <w:t xml:space="preserve"> </w:t>
-      </w:r>
-      <w:r>
-        <w:t xml:space="preserve">Supplementary Note 2: Error model and per-pair standard errors for</w:t>
-      </w:r>
-      <w:r>
-        <w:t xml:space="preserve"> </w:t>
+    <w:bookmarkStart w:id="29" w:name="supplementary-notes"/>
+    <w:p>
+      <w:pPr>
+        <w:pStyle w:val="Heading3"/>
+      </w:pPr>
+      <w:r>
+        <w:t xml:space="preserve">Supplementary Notes</w:t>
+      </w:r>
+    </w:p>
+    <w:p>
+      <w:pPr>
+        <w:pStyle w:val="Compact"/>
+        <w:numPr>
+          <w:ilvl w:val="0"/>
+          <w:numId w:val="1004"/>
+        </w:numPr>
+      </w:pPr>
+      <w:r>
+        <w:rPr>
+          <w:b/>
+          <w:bCs/>
+        </w:rPr>
+        <w:t xml:space="preserve">Supplementary Note 1:</w:t>
+      </w:r>
+      <w:r>
+        <w:t xml:space="preserve"> </w:t>
+      </w:r>
+      <w:r>
+        <w:t xml:space="preserve">Mathematical derivation of the fragmentation principle</w:t>
+      </w:r>
+      <w:r>
+        <w:t xml:space="preserve"> </w:t>
+      </w:r>
+      <w:r>
+        <w:t xml:space="preserve">(</w:t>
       </w:r>
       <w:r>
         <w:rPr>
           <w:rStyle w:val="VerbatimChar"/>
         </w:rPr>
+        <w:t xml:space="preserve">supplementary/Supplementary_Note_1.md</w:t>
+      </w:r>
+      <w:r>
+        <w:t xml:space="preserve">).</w:t>
+      </w:r>
+    </w:p>
+    <w:p>
+      <w:pPr>
+        <w:pStyle w:val="Compact"/>
+        <w:numPr>
+          <w:ilvl w:val="0"/>
+          <w:numId w:val="1004"/>
+        </w:numPr>
+      </w:pPr>
+      <w:r>
+        <w:rPr>
+          <w:b/>
+          <w:bCs/>
+        </w:rPr>
+        <w:t xml:space="preserve">Supplementary Note 2:</w:t>
+      </w:r>
+      <w:r>
+        <w:t xml:space="preserve"> </w:t>
+      </w:r>
+      <w:r>
+        <w:t xml:space="preserve">Error model and per-pair standard errors for</w:t>
+      </w:r>
+      <w:r>
+        <w:t xml:space="preserve"> </w:t>
+      </w:r>
+      <w:r>
+        <w:rPr>
+          <w:rStyle w:val="VerbatimChar"/>
+        </w:rPr>
         <w:t xml:space="preserve">raw_inverted_fraction</w:t>
       </w:r>
       <w:r>
-        <w:t xml:space="preserve">.</w:t>
-      </w:r>
-      <w:r>
-        <w:t xml:space="preserve"> </w:t>
-      </w:r>
-      <w:r>
-        <w:t xml:space="preserve">Supplementary Table 1: GTDB-R207 per-pair structural metrics</w:t>
-      </w:r>
-      <w:r>
         <w:t xml:space="preserve"> </w:t>
       </w:r>
       <w:r>
@@ -6889,22 +6934,160 @@
         <w:rPr>
           <w:rStyle w:val="VerbatimChar"/>
         </w:rPr>
+        <w:t xml:space="preserve">supplementary/Supplementary_Note_2.md</w:t>
+      </w:r>
+      <w:r>
+        <w:t xml:space="preserve">).</w:t>
+      </w:r>
+    </w:p>
+    <w:bookmarkEnd w:id="29"/>
+    <w:bookmarkStart w:id="30" w:name="supplementary-tables"/>
+    <w:p>
+      <w:pPr>
+        <w:pStyle w:val="Heading3"/>
+      </w:pPr>
+      <w:r>
+        <w:t xml:space="preserve">Supplementary Tables</w:t>
+      </w:r>
+    </w:p>
+    <w:p>
+      <w:pPr>
+        <w:pStyle w:val="Compact"/>
+        <w:numPr>
+          <w:ilvl w:val="0"/>
+          <w:numId w:val="1005"/>
+        </w:numPr>
+      </w:pPr>
+      <w:r>
+        <w:rPr>
+          <w:b/>
+          <w:bCs/>
+        </w:rPr>
+        <w:t xml:space="preserve">Supplementary Table 1:</w:t>
+      </w:r>
+      <w:r>
+        <w:t xml:space="preserve"> </w:t>
+      </w:r>
+      <w:r>
+        <w:t xml:space="preserve">GTDB-R207 per-pair structural metrics</w:t>
+      </w:r>
+      <w:r>
+        <w:t xml:space="preserve"> </w:t>
+      </w:r>
+      <w:r>
+        <w:t xml:space="preserve">(</w:t>
+      </w:r>
+      <w:r>
+        <w:rPr>
+          <w:rStyle w:val="VerbatimChar"/>
+        </w:rPr>
         <w:t xml:space="preserve">results/gtdb50k/inverted_fraction_truth_four.tsv</w:t>
       </w:r>
       <w:r>
         <w:t xml:space="preserve">).</w:t>
       </w:r>
-      <w:r>
-        <w:t xml:space="preserve"> </w:t>
-      </w:r>
-      <w:r>
-        <w:t xml:space="preserve">Supplementary Table 2: Runtime comparison with alignment-based methods.</w:t>
-      </w:r>
-      <w:r>
-        <w:t xml:space="preserve"> </w:t>
-      </w:r>
-      <w:r>
-        <w:t xml:space="preserve">Supplementary Figure 1: Tag spacing distribution for the production four-enzyme panel in</w:t>
+    </w:p>
+    <w:p>
+      <w:pPr>
+        <w:pStyle w:val="Compact"/>
+        <w:numPr>
+          <w:ilvl w:val="0"/>
+          <w:numId w:val="1005"/>
+        </w:numPr>
+      </w:pPr>
+      <w:r>
+        <w:rPr>
+          <w:b/>
+          <w:bCs/>
+        </w:rPr>
+        <w:t xml:space="preserve">Supplementary Table 2:</w:t>
+      </w:r>
+      <w:r>
+        <w:t xml:space="preserve"> </w:t>
+      </w:r>
+      <w:r>
+        <w:t xml:space="preserve">Runtime comparison with alignment-based methods</w:t>
+      </w:r>
+      <w:r>
+        <w:t xml:space="preserve"> </w:t>
+      </w:r>
+      <w:r>
+        <w:t xml:space="preserve">(to be added from HPC head-to-head logs).</w:t>
+      </w:r>
+    </w:p>
+    <w:p>
+      <w:pPr>
+        <w:pStyle w:val="Compact"/>
+        <w:numPr>
+          <w:ilvl w:val="0"/>
+          <w:numId w:val="1005"/>
+        </w:numPr>
+      </w:pPr>
+      <w:r>
+        <w:rPr>
+          <w:b/>
+          <w:bCs/>
+        </w:rPr>
+        <w:t xml:space="preserve">Supplementary Table 3:</w:t>
+      </w:r>
+      <w:r>
+        <w:t xml:space="preserve"> </w:t>
+      </w:r>
+      <w:r>
+        <w:t xml:space="preserve">Parameters for the controlled SV simulations</w:t>
+      </w:r>
+      <w:r>
+        <w:t xml:space="preserve"> </w:t>
+      </w:r>
+      <w:r>
+        <w:t xml:space="preserve">(</w:t>
+      </w:r>
+      <w:r>
+        <w:rPr>
+          <w:rStyle w:val="VerbatimChar"/>
+        </w:rPr>
+        <w:t xml:space="preserve">supplementary/Supplementary_Table_3.tsv</w:t>
+      </w:r>
+      <w:r>
+        <w:t xml:space="preserve">).</w:t>
+      </w:r>
+    </w:p>
+    <w:bookmarkEnd w:id="30"/>
+    <w:bookmarkStart w:id="31" w:name="supplementary-figures"/>
+    <w:p>
+      <w:pPr>
+        <w:pStyle w:val="Heading3"/>
+      </w:pPr>
+      <w:r>
+        <w:t xml:space="preserve">Supplementary Figures</w:t>
+      </w:r>
+    </w:p>
+    <w:p>
+      <w:pPr>
+        <w:pStyle w:val="Compact"/>
+        <w:numPr>
+          <w:ilvl w:val="0"/>
+          <w:numId w:val="1006"/>
+        </w:numPr>
+      </w:pPr>
+      <w:r>
+        <w:rPr>
+          <w:b/>
+          <w:bCs/>
+        </w:rPr>
+        <w:t xml:space="preserve">Supplementary Figure 1:</w:t>
+      </w:r>
+      <w:r>
+        <w:t xml:space="preserve"> </w:t>
+      </w:r>
+      <w:r>
+        <w:t xml:space="preserve">Tag spacing distribution for the production</w:t>
+      </w:r>
+      <w:r>
+        <w:t xml:space="preserve"> </w:t>
+      </w:r>
+      <w:r>
+        <w:t xml:space="preserve">four-enzyme panel in</w:t>
       </w:r>
       <w:r>
         <w:t xml:space="preserve"> </w:t>
@@ -6920,7 +7103,13 @@
         <w:t xml:space="preserve"> </w:t>
       </w:r>
       <w:r>
-        <w:t xml:space="preserve">K-12. Inter-tag distances were extracted from the TGT output of</w:t>
+        <w:t xml:space="preserve">K-12. Inter-tag distances were extracted from</w:t>
+      </w:r>
+      <w:r>
+        <w:t xml:space="preserve"> </w:t>
+      </w:r>
+      <w:r>
+        <w:t xml:space="preserve">the TGT output of</w:t>
       </w:r>
       <w:r>
         <w:t xml:space="preserve"> </w:t>
@@ -6935,19 +7124,135 @@
         <w:t xml:space="preserve"> </w:t>
       </w:r>
       <w:r>
-        <w:t xml:space="preserve">(n = 6,215 intervals). Median spacing is 1,533 bp and mean spacing is 2,980 bp.</w:t>
-      </w:r>
-      <w:r>
-        <w:t xml:space="preserve"> </w:t>
-      </w:r>
-      <w:r>
-        <w:t xml:space="preserve">Supplementary Figure 2: Closed-genome inversion validation on 100 complete-genome pairs selected for high expected structural divergence. (a) Number of junctions reported by Syn2b versus dnadiff. (b) Fraction of dnadiff junctions that match a Syn2b junction. (c) Median distance between matched Syn2b and dnadiff junction positions. The low recovery and coarse position resolution reflect that many dnadiff inversions fall in regions without a nearby restriction-enzyme landmark.</w:t>
-      </w:r>
-      <w:r>
-        <w:t xml:space="preserve"> </w:t>
-      </w:r>
-      <w:r>
-        <w:t xml:space="preserve">Supplementary Figure 3: Sensitivity of Syn2b junction counts and raw inverted fraction to SV size. Controlled</w:t>
+        <w:t xml:space="preserve">(n = 6,215 intervals). Median spacing is</w:t>
+      </w:r>
+      <w:r>
+        <w:t xml:space="preserve"> </w:t>
+      </w:r>
+      <w:r>
+        <w:t xml:space="preserve">1,533 bp and mean spacing is 2,980 bp</w:t>
+      </w:r>
+      <w:r>
+        <w:t xml:space="preserve"> </w:t>
+      </w:r>
+      <w:r>
+        <w:t xml:space="preserve">(</w:t>
+      </w:r>
+      <w:r>
+        <w:rPr>
+          <w:rStyle w:val="VerbatimChar"/>
+        </w:rPr>
+        <w:t xml:space="preserve">figures/supplementary/fig1_tag_spacing.png</w:t>
+      </w:r>
+      <w:r>
+        <w:t xml:space="preserve">).</w:t>
+      </w:r>
+    </w:p>
+    <w:p>
+      <w:pPr>
+        <w:pStyle w:val="Compact"/>
+        <w:numPr>
+          <w:ilvl w:val="0"/>
+          <w:numId w:val="1006"/>
+        </w:numPr>
+      </w:pPr>
+      <w:r>
+        <w:rPr>
+          <w:b/>
+          <w:bCs/>
+        </w:rPr>
+        <w:t xml:space="preserve">Supplementary Figure 2:</w:t>
+      </w:r>
+      <w:r>
+        <w:t xml:space="preserve"> </w:t>
+      </w:r>
+      <w:r>
+        <w:t xml:space="preserve">Closed-genome inversion validation on 100</w:t>
+      </w:r>
+      <w:r>
+        <w:t xml:space="preserve"> </w:t>
+      </w:r>
+      <w:r>
+        <w:t xml:space="preserve">complete-genome pairs selected for high expected structural divergence.</w:t>
+      </w:r>
+    </w:p>
+    <w:p>
+      <w:pPr>
+        <w:pStyle w:val="Compact"/>
+        <w:numPr>
+          <w:ilvl w:val="1"/>
+          <w:numId w:val="1007"/>
+        </w:numPr>
+      </w:pPr>
+      <w:r>
+        <w:t xml:space="preserve">Number of junctions reported by Syn2b versus dnadiff. (b) Fraction of</w:t>
+      </w:r>
+      <w:r>
+        <w:t xml:space="preserve"> </w:t>
+      </w:r>
+      <w:r>
+        <w:t xml:space="preserve">dnadiff junctions that match a Syn2b junction. (c) Median distance between</w:t>
+      </w:r>
+      <w:r>
+        <w:t xml:space="preserve"> </w:t>
+      </w:r>
+      <w:r>
+        <w:t xml:space="preserve">matched Syn2b and dnadiff junction positions. The low recovery and coarse</w:t>
+      </w:r>
+      <w:r>
+        <w:t xml:space="preserve"> </w:t>
+      </w:r>
+      <w:r>
+        <w:t xml:space="preserve">position resolution reflect that many dnadiff inversions fall in regions</w:t>
+      </w:r>
+      <w:r>
+        <w:t xml:space="preserve"> </w:t>
+      </w:r>
+      <w:r>
+        <w:t xml:space="preserve">without a nearby restriction-enzyme landmark</w:t>
+      </w:r>
+      <w:r>
+        <w:t xml:space="preserve"> </w:t>
+      </w:r>
+      <w:r>
+        <w:t xml:space="preserve">(</w:t>
+      </w:r>
+      <w:r>
+        <w:rPr>
+          <w:rStyle w:val="VerbatimChar"/>
+        </w:rPr>
+        <w:t xml:space="preserve">figures/supplementary/fig2_closed_genome_validation.png</w:t>
+      </w:r>
+      <w:r>
+        <w:t xml:space="preserve">).</w:t>
+      </w:r>
+    </w:p>
+    <w:p>
+      <w:pPr>
+        <w:pStyle w:val="Compact"/>
+        <w:numPr>
+          <w:ilvl w:val="0"/>
+          <w:numId w:val="1006"/>
+        </w:numPr>
+      </w:pPr>
+      <w:r>
+        <w:rPr>
+          <w:b/>
+          <w:bCs/>
+        </w:rPr>
+        <w:t xml:space="preserve">Supplementary Figure 3:</w:t>
+      </w:r>
+      <w:r>
+        <w:t xml:space="preserve"> </w:t>
+      </w:r>
+      <w:r>
+        <w:t xml:space="preserve">Sensitivity of Syn2b junction counts and raw</w:t>
+      </w:r>
+      <w:r>
+        <w:t xml:space="preserve"> </w:t>
+      </w:r>
+      <w:r>
+        <w:t xml:space="preserve">inverted fraction to SV size. Controlled</w:t>
       </w:r>
       <w:r>
         <w:t xml:space="preserve"> </w:t>
@@ -6963,7 +7268,58 @@
         <w:t xml:space="preserve"> </w:t>
       </w:r>
       <w:r>
-        <w:t xml:space="preserve">K-12 variants carrying a single inversion, insertion, deletion, or translocation on a 1% SNP background were analysed with the four-enzyme panel. Inversions yield two junctions irrespective of size, while the inverted fraction increases with inverted segment length. Insertions and deletions produce zero junctions unless a landmark straddles the breakpoint; translocation of a 500-kb segment yields three junctions.</w:t>
+        <w:t xml:space="preserve">K-12 variants carrying a</w:t>
+      </w:r>
+      <w:r>
+        <w:t xml:space="preserve"> </w:t>
+      </w:r>
+      <w:r>
+        <w:t xml:space="preserve">single inversion, insertion, deletion, or translocation on a 1% SNP</w:t>
+      </w:r>
+      <w:r>
+        <w:t xml:space="preserve"> </w:t>
+      </w:r>
+      <w:r>
+        <w:t xml:space="preserve">background were analysed with the four-enzyme panel. Inversions yield two</w:t>
+      </w:r>
+      <w:r>
+        <w:t xml:space="preserve"> </w:t>
+      </w:r>
+      <w:r>
+        <w:t xml:space="preserve">junctions irrespective of size, while the inverted fraction increases with</w:t>
+      </w:r>
+      <w:r>
+        <w:t xml:space="preserve"> </w:t>
+      </w:r>
+      <w:r>
+        <w:t xml:space="preserve">inverted segment length. Insertions and deletions produce zero junctions</w:t>
+      </w:r>
+      <w:r>
+        <w:t xml:space="preserve"> </w:t>
+      </w:r>
+      <w:r>
+        <w:t xml:space="preserve">unless a landmark straddles the breakpoint; translocation of a 500-kb segment</w:t>
+      </w:r>
+      <w:r>
+        <w:t xml:space="preserve"> </w:t>
+      </w:r>
+      <w:r>
+        <w:t xml:space="preserve">yields three junctions</w:t>
+      </w:r>
+      <w:r>
+        <w:t xml:space="preserve"> </w:t>
+      </w:r>
+      <w:r>
+        <w:t xml:space="preserve">(</w:t>
+      </w:r>
+      <w:r>
+        <w:rPr>
+          <w:rStyle w:val="VerbatimChar"/>
+        </w:rPr>
+        <w:t xml:space="preserve">figures/supplementary/fig3_sv_size_sensitivity.png</w:t>
+      </w:r>
+      <w:r>
+        <w:t xml:space="preserve">).</w:t>
       </w:r>
     </w:p>
     <w:p>
@@ -6973,8 +7329,9 @@
         </w:pict>
       </w:r>
     </w:p>
-    <w:bookmarkEnd w:id="29"/>
-    <w:bookmarkStart w:id="30" w:name="acknowledgements"/>
+    <w:bookmarkEnd w:id="31"/>
+    <w:bookmarkEnd w:id="32"/>
+    <w:bookmarkStart w:id="33" w:name="acknowledgements"/>
     <w:p>
       <w:pPr>
         <w:pStyle w:val="Heading2"/>
@@ -6991,8 +7348,8 @@
         <w:t xml:space="preserve">Funding information to be added.</w:t>
       </w:r>
     </w:p>
-    <w:bookmarkEnd w:id="30"/>
-    <w:bookmarkStart w:id="31" w:name="author-contributions"/>
+    <w:bookmarkEnd w:id="33"/>
+    <w:bookmarkStart w:id="34" w:name="author-contributions"/>
     <w:p>
       <w:pPr>
         <w:pStyle w:val="Heading2"/>
@@ -7021,8 +7378,8 @@
         <w:t xml:space="preserve">manuscript.</w:t>
       </w:r>
     </w:p>
-    <w:bookmarkEnd w:id="31"/>
-    <w:bookmarkStart w:id="32" w:name="competing-interests"/>
+    <w:bookmarkEnd w:id="34"/>
+    <w:bookmarkStart w:id="35" w:name="competing-interests"/>
     <w:p>
       <w:pPr>
         <w:pStyle w:val="Heading2"/>
@@ -7039,8 +7396,8 @@
         <w:t xml:space="preserve">The authors declare no competing interests.</w:t>
       </w:r>
     </w:p>
-    <w:bookmarkEnd w:id="32"/>
-    <w:bookmarkEnd w:id="33"/>
+    <w:bookmarkEnd w:id="35"/>
+    <w:bookmarkEnd w:id="36"/>
     <w:sectPr>
       <w:footnotePr>
         <w:numRestart w:val="eachSect"/>
@@ -7230,6 +7587,194 @@
       <w:start w:val="1"/>
       <w:numFmt w:val="decimal"/>
       <w:lvlText w:val="%9."/>
+      <w:lvlJc w:val="left"/>
+      <w:pPr>
+        <w:ind w:left="6480" w:hanging="360"/>
+      </w:pPr>
+    </w:lvl>
+  </w:abstractNum>
+  <w:abstractNum w:abstractNumId="991">
+    <w:nsid w:val="0000A991"/>
+    <w:multiLevelType w:val="multilevel"/>
+    <w:lvl w:ilvl="0">
+      <w:numFmt w:val="bullet"/>
+      <w:lvlText w:val=""/>
+      <w:lvlJc w:val="left"/>
+      <w:pPr>
+        <w:ind w:left="720" w:hanging="360"/>
+      </w:pPr>
+      <w:rPr>
+        <w:rFonts w:ascii="Symbol" w:hAnsi="Symbol" w:cs="Symbol" w:hint="default"/>
+      </w:rPr>
+    </w:lvl>
+    <w:lvl w:ilvl="1">
+      <w:numFmt w:val="bullet"/>
+      <w:lvlText w:val="o"/>
+      <w:lvlJc w:val="left"/>
+      <w:pPr>
+        <w:ind w:left="1440" w:hanging="360"/>
+      </w:pPr>
+      <w:rPr>
+        <w:rFonts w:ascii="Courier New" w:hAnsi="Courier New" w:cs="Courier New" w:hint="default"/>
+      </w:rPr>
+    </w:lvl>
+    <w:lvl w:ilvl="2">
+      <w:numFmt w:val="bullet"/>
+      <w:lvlText w:val=""/>
+      <w:lvlJc w:val="left"/>
+      <w:pPr>
+        <w:ind w:left="2160" w:hanging="360"/>
+      </w:pPr>
+      <w:rPr>
+        <w:rFonts w:ascii="Wingdings" w:hAnsi="Wingdings" w:cs="Wingdings" w:hint="default"/>
+      </w:rPr>
+    </w:lvl>
+    <w:lvl w:ilvl="3">
+      <w:numFmt w:val="bullet"/>
+      <w:lvlText w:val=""/>
+      <w:lvlJc w:val="left"/>
+      <w:pPr>
+        <w:ind w:left="2880" w:hanging="360"/>
+      </w:pPr>
+      <w:rPr>
+        <w:rFonts w:ascii="Symbol" w:hAnsi="Symbol" w:cs="Symbol" w:hint="default"/>
+      </w:rPr>
+    </w:lvl>
+    <w:lvl w:ilvl="4">
+      <w:numFmt w:val="bullet"/>
+      <w:lvlText w:val="o"/>
+      <w:lvlJc w:val="left"/>
+      <w:pPr>
+        <w:ind w:left="3600" w:hanging="360"/>
+      </w:pPr>
+      <w:rPr>
+        <w:rFonts w:ascii="Courier New" w:hAnsi="Courier New" w:cs="Courier New" w:hint="default"/>
+      </w:rPr>
+    </w:lvl>
+    <w:lvl w:ilvl="5">
+      <w:numFmt w:val="bullet"/>
+      <w:lvlText w:val=""/>
+      <w:lvlJc w:val="left"/>
+      <w:pPr>
+        <w:ind w:left="4320" w:hanging="360"/>
+      </w:pPr>
+      <w:rPr>
+        <w:rFonts w:ascii="Wingdings" w:hAnsi="Wingdings" w:cs="Wingdings" w:hint="default"/>
+      </w:rPr>
+    </w:lvl>
+    <w:lvl w:ilvl="6">
+      <w:numFmt w:val="bullet"/>
+      <w:lvlText w:val=""/>
+      <w:lvlJc w:val="left"/>
+      <w:pPr>
+        <w:ind w:left="5040" w:hanging="360"/>
+      </w:pPr>
+      <w:rPr>
+        <w:rFonts w:ascii="Symbol" w:hAnsi="Symbol" w:cs="Symbol" w:hint="default"/>
+      </w:rPr>
+    </w:lvl>
+    <w:lvl w:ilvl="7">
+      <w:numFmt w:val="bullet"/>
+      <w:lvlText w:val="o"/>
+      <w:lvlJc w:val="left"/>
+      <w:pPr>
+        <w:ind w:left="5760" w:hanging="360"/>
+      </w:pPr>
+      <w:rPr>
+        <w:rFonts w:ascii="Courier New" w:hAnsi="Courier New" w:cs="Courier New" w:hint="default"/>
+      </w:rPr>
+    </w:lvl>
+    <w:lvl w:ilvl="8">
+      <w:numFmt w:val="bullet"/>
+      <w:lvlText w:val=""/>
+      <w:lvlJc w:val="left"/>
+      <w:pPr>
+        <w:ind w:left="6480" w:hanging="360"/>
+      </w:pPr>
+      <w:rPr>
+        <w:rFonts w:ascii="Wingdings" w:hAnsi="Wingdings" w:cs="Wingdings" w:hint="default"/>
+      </w:rPr>
+    </w:lvl>
+  </w:abstractNum>
+  <w:abstractNum w:abstractNumId="99731">
+    <w:nsid w:val="00A99731"/>
+    <w:multiLevelType w:val="multilevel"/>
+    <w:lvl w:ilvl="0">
+      <w:start w:val="1"/>
+      <w:numFmt w:val="lowerLetter"/>
+      <w:lvlText w:val="(%1)"/>
+      <w:lvlJc w:val="left"/>
+      <w:pPr>
+        <w:ind w:left="720" w:hanging="360"/>
+      </w:pPr>
+    </w:lvl>
+    <w:lvl w:ilvl="1">
+      <w:start w:val="1"/>
+      <w:numFmt w:val="lowerLetter"/>
+      <w:lvlText w:val="(%2)"/>
+      <w:lvlJc w:val="left"/>
+      <w:pPr>
+        <w:ind w:left="1440" w:hanging="360"/>
+      </w:pPr>
+    </w:lvl>
+    <w:lvl w:ilvl="2">
+      <w:start w:val="1"/>
+      <w:numFmt w:val="lowerLetter"/>
+      <w:lvlText w:val="(%3)"/>
+      <w:lvlJc w:val="left"/>
+      <w:pPr>
+        <w:ind w:left="2160" w:hanging="360"/>
+      </w:pPr>
+    </w:lvl>
+    <w:lvl w:ilvl="3">
+      <w:start w:val="1"/>
+      <w:numFmt w:val="lowerLetter"/>
+      <w:lvlText w:val="(%4)"/>
+      <w:lvlJc w:val="left"/>
+      <w:pPr>
+        <w:ind w:left="2880" w:hanging="360"/>
+      </w:pPr>
+    </w:lvl>
+    <w:lvl w:ilvl="4">
+      <w:start w:val="1"/>
+      <w:numFmt w:val="lowerLetter"/>
+      <w:lvlText w:val="(%5)"/>
+      <w:lvlJc w:val="left"/>
+      <w:pPr>
+        <w:ind w:left="3600" w:hanging="360"/>
+      </w:pPr>
+    </w:lvl>
+    <w:lvl w:ilvl="5">
+      <w:start w:val="1"/>
+      <w:numFmt w:val="lowerLetter"/>
+      <w:lvlText w:val="(%6)"/>
+      <w:lvlJc w:val="left"/>
+      <w:pPr>
+        <w:ind w:left="4320" w:hanging="360"/>
+      </w:pPr>
+    </w:lvl>
+    <w:lvl w:ilvl="6">
+      <w:start w:val="1"/>
+      <w:numFmt w:val="lowerLetter"/>
+      <w:lvlText w:val="(%7)"/>
+      <w:lvlJc w:val="left"/>
+      <w:pPr>
+        <w:ind w:left="5040" w:hanging="360"/>
+      </w:pPr>
+    </w:lvl>
+    <w:lvl w:ilvl="7">
+      <w:start w:val="1"/>
+      <w:numFmt w:val="lowerLetter"/>
+      <w:lvlText w:val="(%8)"/>
+      <w:lvlJc w:val="left"/>
+      <w:pPr>
+        <w:ind w:left="5760" w:hanging="360"/>
+      </w:pPr>
+    </w:lvl>
+    <w:lvl w:ilvl="8">
+      <w:start w:val="1"/>
+      <w:numFmt w:val="lowerLetter"/>
+      <w:lvlText w:val="(%9)"/>
       <w:lvlJc w:val="left"/>
       <w:pPr>
         <w:ind w:left="6480" w:hanging="360"/>
@@ -7301,6 +7846,45 @@
   </w:num>
   <w:num w:numId="1003">
     <w:abstractNumId w:val="99411"/>
+    <w:lvlOverride w:ilvl="0">
+      <w:startOverride w:val="1"/>
+    </w:lvlOverride>
+    <w:lvlOverride w:ilvl="1">
+      <w:startOverride w:val="1"/>
+    </w:lvlOverride>
+    <w:lvlOverride w:ilvl="2">
+      <w:startOverride w:val="1"/>
+    </w:lvlOverride>
+    <w:lvlOverride w:ilvl="3">
+      <w:startOverride w:val="1"/>
+    </w:lvlOverride>
+    <w:lvlOverride w:ilvl="4">
+      <w:startOverride w:val="1"/>
+    </w:lvlOverride>
+    <w:lvlOverride w:ilvl="5">
+      <w:startOverride w:val="1"/>
+    </w:lvlOverride>
+    <w:lvlOverride w:ilvl="6">
+      <w:startOverride w:val="1"/>
+    </w:lvlOverride>
+    <w:lvlOverride w:ilvl="7">
+      <w:startOverride w:val="1"/>
+    </w:lvlOverride>
+    <w:lvlOverride w:ilvl="8">
+      <w:startOverride w:val="1"/>
+    </w:lvlOverride>
+  </w:num>
+  <w:num w:numId="1004">
+    <w:abstractNumId w:val="991"/>
+  </w:num>
+  <w:num w:numId="1005">
+    <w:abstractNumId w:val="991"/>
+  </w:num>
+  <w:num w:numId="1006">
+    <w:abstractNumId w:val="991"/>
+  </w:num>
+  <w:num w:numId="1007">
+    <w:abstractNumId w:val="99731"/>
     <w:lvlOverride w:ilvl="0">
       <w:startOverride w:val="1"/>
     </w:lvlOverride>

</xml_diff>

<commit_message>
Add Supplementary Tables 2 and 4 from HPC benchmark data; fix runtime table references
</commit_message>
<xml_diff>
--- a/Syn2b_Manuscript.docx
+++ b/Syn2b_Manuscript.docx
@@ -3787,7 +3787,7 @@
         <w:t xml:space="preserve"> </w:t>
       </w:r>
       <w:r>
-        <w:t xml:space="preserve">ms/pair for 22 genomes (Table 4). The n = 2 case is dominated by startup</w:t>
+        <w:t xml:space="preserve">ms/pair for 22 genomes (Figure 5b). The n = 2 case is dominated by startup</w:t>
       </w:r>
       <w:r>
         <w:t xml:space="preserve"> </w:t>
@@ -3819,31 +3819,49 @@
         <w:t xml:space="preserve"> </w:t>
       </w:r>
       <w:r>
-        <w:t xml:space="preserve">benchmark peaked at ~2.3 GB RSS, well within standard laptop limits. Because</w:t>
-      </w:r>
-      <w:r>
-        <w:t xml:space="preserve"> </w:t>
-      </w:r>
-      <w:r>
-        <w:t xml:space="preserve">Syn2b avoids pairwise alignment and BLAST database construction, it is expected</w:t>
-      </w:r>
-      <w:r>
-        <w:t xml:space="preserve"> </w:t>
-      </w:r>
-      <w:r>
-        <w:t xml:space="preserve">to be orders of magnitude faster than alignment-based methods such as</w:t>
-      </w:r>
-      <w:r>
-        <w:t xml:space="preserve"> </w:t>
-      </w:r>
-      <w:r>
-        <w:t xml:space="preserve">SynTracker; a direct head-to-head comparison is provided in Supplementary Table</w:t>
-      </w:r>
-      <w:r>
-        <w:t xml:space="preserve"> </w:t>
-      </w:r>
-      <w:r>
-        <w:t xml:space="preserve">4.</w:t>
+        <w:t xml:space="preserve">benchmark peaked at ~2.3 GB RSS, well within standard laptop limits. On the</w:t>
+      </w:r>
+      <w:r>
+        <w:t xml:space="preserve"> </w:t>
+      </w:r>
+      <w:r>
+        <w:t xml:space="preserve">same 22-genome panel (484 ordered pairs), Syn2b completed structural comparison</w:t>
+      </w:r>
+      <w:r>
+        <w:t xml:space="preserve"> </w:t>
+      </w:r>
+      <w:r>
+        <w:t xml:space="preserve">in 4.4 s, versus 1,844 s for the skani+dnadiff workflow — a ~420-fold speedup</w:t>
+      </w:r>
+      <w:r>
+        <w:t xml:space="preserve"> </w:t>
+      </w:r>
+      <w:r>
+        <w:t xml:space="preserve">(Supplementary Table 4). Supplementary Table 2 gives the scaling across panel</w:t>
+      </w:r>
+      <w:r>
+        <w:t xml:space="preserve"> </w:t>
+      </w:r>
+      <w:r>
+        <w:t xml:space="preserve">sizes. SynTracker itself was not timed because its DECIPHER R dependency is not</w:t>
+      </w:r>
+      <w:r>
+        <w:t xml:space="preserve"> </w:t>
+      </w:r>
+      <w:r>
+        <w:t xml:space="preserve">available on our HPC, but its BLAST database construction and all-versus-all</w:t>
+      </w:r>
+      <w:r>
+        <w:t xml:space="preserve"> </w:t>
+      </w:r>
+      <w:r>
+        <w:t xml:space="preserve">DECIPHER alignment are at least as expensive as the nucmer-based dnadiff stage</w:t>
+      </w:r>
+      <w:r>
+        <w:t xml:space="preserve"> </w:t>
+      </w:r>
+      <w:r>
+        <w:t xml:space="preserve">benchmarked here.</w:t>
       </w:r>
     </w:p>
     <w:p>
@@ -3905,49 +3923,67 @@
           <w:b/>
           <w:bCs/>
         </w:rPr>
-        <w:t xml:space="preserve">Comparison to SynTracker.</w:t>
-      </w:r>
-      <w:r>
-        <w:t xml:space="preserve"> </w:t>
-      </w:r>
-      <w:r>
-        <w:t xml:space="preserve">SynTracker pioneered microsynteny for strain</w:t>
-      </w:r>
-      <w:r>
-        <w:t xml:space="preserve"> </w:t>
-      </w:r>
-      <w:r>
-        <w:t xml:space="preserve">comparison but requires BLAST databases and all-versus-all DECIPHER alignments.</w:t>
-      </w:r>
-      <w:r>
-        <w:t xml:space="preserve"> </w:t>
-      </w:r>
-      <w:r>
-        <w:t xml:space="preserve">Syn2b achieves the same biological goal through Type IIB tag adjacency, without</w:t>
-      </w:r>
-      <w:r>
-        <w:t xml:space="preserve"> </w:t>
-      </w:r>
-      <w:r>
-        <w:t xml:space="preserve">pairwise alignment or a pre-built database, and is therefore expected to be</w:t>
-      </w:r>
-      <w:r>
-        <w:t xml:space="preserve"> </w:t>
-      </w:r>
-      <w:r>
-        <w:t xml:space="preserve">orders of magnitude faster for large panels (Supplementary Table 4). The GTDB</w:t>
-      </w:r>
-      <w:r>
-        <w:t xml:space="preserve"> </w:t>
-      </w:r>
-      <w:r>
-        <w:t xml:space="preserve">validation shows that the orientation ratio alone matches dnadiff at r = 0.94</w:t>
-      </w:r>
-      <w:r>
-        <w:t xml:space="preserve"> </w:t>
-      </w:r>
-      <w:r>
-        <w:t xml:space="preserve">overall and r = 0.996 at ANIm ≥ 97%.</w:t>
+        <w:t xml:space="preserve">Comparison to microsynteny and alignment-based workflows.</w:t>
+      </w:r>
+      <w:r>
+        <w:t xml:space="preserve"> </w:t>
+      </w:r>
+      <w:r>
+        <w:t xml:space="preserve">SynTracker</w:t>
+      </w:r>
+      <w:r>
+        <w:t xml:space="preserve"> </w:t>
+      </w:r>
+      <w:r>
+        <w:t xml:space="preserve">pioneered microsynteny for strain comparison but requires BLAST databases and</w:t>
+      </w:r>
+      <w:r>
+        <w:t xml:space="preserve"> </w:t>
+      </w:r>
+      <w:r>
+        <w:t xml:space="preserve">all-versus-all DECIPHER alignments. Alignment-based SV callers such as dnadiff</w:t>
+      </w:r>
+      <w:r>
+        <w:t xml:space="preserve"> </w:t>
+      </w:r>
+      <w:r>
+        <w:t xml:space="preserve">provide ground truth but require a pairwise nucmer alignment per genome pair</w:t>
+      </w:r>
+      <w:r>
+        <w:t xml:space="preserve"> </w:t>
+      </w:r>
+      <w:r>
+        <w:t xml:space="preserve">(~3.8 s per pair on our benchmark; Supplementary Table 4). Syn2b achieves the</w:t>
+      </w:r>
+      <w:r>
+        <w:t xml:space="preserve"> </w:t>
+      </w:r>
+      <w:r>
+        <w:t xml:space="preserve">same structural signal through Type IIB tag adjacency, without pairwise</w:t>
+      </w:r>
+      <w:r>
+        <w:t xml:space="preserve"> </w:t>
+      </w:r>
+      <w:r>
+        <w:t xml:space="preserve">alignment or a pre-built database, and is therefore orders of magnitude faster</w:t>
+      </w:r>
+      <w:r>
+        <w:t xml:space="preserve"> </w:t>
+      </w:r>
+      <w:r>
+        <w:t xml:space="preserve">for large panels (~9 ms per pair). The GTDB validation shows that the</w:t>
+      </w:r>
+      <w:r>
+        <w:t xml:space="preserve"> </w:t>
+      </w:r>
+      <w:r>
+        <w:t xml:space="preserve">orientation ratio alone matches dnadiff at r = 0.94 overall and r = 0.996 at</w:t>
+      </w:r>
+      <w:r>
+        <w:t xml:space="preserve"> </w:t>
+      </w:r>
+      <w:r>
+        <w:t xml:space="preserve">ANIm ≥ 97%.</w:t>
       </w:r>
     </w:p>
     <w:p>
@@ -7006,13 +7042,28 @@
         <w:t xml:space="preserve"> </w:t>
       </w:r>
       <w:r>
-        <w:t xml:space="preserve">Runtime comparison with alignment-based methods</w:t>
-      </w:r>
-      <w:r>
-        <w:t xml:space="preserve"> </w:t>
-      </w:r>
-      <w:r>
-        <w:t xml:space="preserve">(to be added from HPC head-to-head logs).</w:t>
+        <w:t xml:space="preserve">Runtime scaling of Syn2b structural comparison,</w:t>
+      </w:r>
+      <w:r>
+        <w:t xml:space="preserve"> </w:t>
+      </w:r>
+      <w:r>
+        <w:t xml:space="preserve">skani, dnadiff, and skani+dnadiff across panel sizes</w:t>
+      </w:r>
+      <w:r>
+        <w:t xml:space="preserve"> </w:t>
+      </w:r>
+      <w:r>
+        <w:t xml:space="preserve">(</w:t>
+      </w:r>
+      <w:r>
+        <w:rPr>
+          <w:rStyle w:val="VerbatimChar"/>
+        </w:rPr>
+        <w:t xml:space="preserve">supplementary/Supplementary_Table_2.tsv</w:t>
+      </w:r>
+      <w:r>
+        <w:t xml:space="preserve">).</w:t>
       </w:r>
     </w:p>
     <w:p>
@@ -7052,6 +7103,952 @@
         <w:t xml:space="preserve">).</w:t>
       </w:r>
     </w:p>
+    <w:p>
+      <w:pPr>
+        <w:pStyle w:val="Compact"/>
+        <w:numPr>
+          <w:ilvl w:val="0"/>
+          <w:numId w:val="1005"/>
+        </w:numPr>
+      </w:pPr>
+      <w:r>
+        <w:rPr>
+          <w:b/>
+          <w:bCs/>
+        </w:rPr>
+        <w:t xml:space="preserve">Supplementary Table 4:</w:t>
+      </w:r>
+      <w:r>
+        <w:t xml:space="preserve"> </w:t>
+      </w:r>
+      <w:r>
+        <w:t xml:space="preserve">Head-to-head runtime on the 22-genome panel</w:t>
+      </w:r>
+      <w:r>
+        <w:t xml:space="preserve"> </w:t>
+      </w:r>
+      <w:r>
+        <w:t xml:space="preserve">(484 ordered pairs) (</w:t>
+      </w:r>
+      <w:r>
+        <w:rPr>
+          <w:rStyle w:val="VerbatimChar"/>
+        </w:rPr>
+        <w:t xml:space="preserve">supplementary/Supplementary_Table_4.tsv</w:t>
+      </w:r>
+      <w:r>
+        <w:t xml:space="preserve">).</w:t>
+      </w:r>
+    </w:p>
+    <w:p>
+      <w:pPr>
+        <w:pStyle w:val="FirstParagraph"/>
+      </w:pPr>
+      <w:r>
+        <w:rPr>
+          <w:b/>
+          <w:bCs/>
+        </w:rPr>
+        <w:t xml:space="preserve">Supplementary Table 2.</w:t>
+      </w:r>
+      <w:r>
+        <w:t xml:space="preserve"> </w:t>
+      </w:r>
+      <w:r>
+        <w:t xml:space="preserve">Runtime scaling across panel sizes. Wall times are</w:t>
+      </w:r>
+      <w:r>
+        <w:t xml:space="preserve"> </w:t>
+      </w:r>
+      <w:r>
+        <w:t xml:space="preserve">means of three replicates on the HPC (16 cores for skani/dnadiff). Per-pair</w:t>
+      </w:r>
+      <w:r>
+        <w:t xml:space="preserve"> </w:t>
+      </w:r>
+      <w:r>
+        <w:t xml:space="preserve">times use the n² ordered pairs recorded in the benchmark.</w:t>
+      </w:r>
+    </w:p>
+    <w:tbl>
+      <w:tblPr>
+        <w:tblStyle w:val="Table"/>
+        <w:tblW w:type="pct" w:w="5000"/>
+        <w:tblLayout w:type="fixed"/>
+        <w:tblLook w:firstRow="1" w:lastRow="0" w:firstColumn="0" w:lastColumn="0" w:noHBand="0" w:noVBand="0" w:val="0020"/>
+      </w:tblPr>
+      <w:tblGrid>
+        <w:gridCol w:w="880"/>
+        <w:gridCol w:w="1173"/>
+        <w:gridCol w:w="1173"/>
+        <w:gridCol w:w="1173"/>
+        <w:gridCol w:w="1173"/>
+        <w:gridCol w:w="1173"/>
+        <w:gridCol w:w="1173"/>
+      </w:tblGrid>
+      <w:tr>
+        <w:trPr>
+          <w:tblHeader w:val="on"/>
+        </w:trPr>
+        <w:tc>
+          <w:tcPr/>
+          <w:p>
+            <w:pPr>
+              <w:pStyle w:val="Compact"/>
+            </w:pPr>
+            <w:r>
+              <w:t xml:space="preserve">n genomes</w:t>
+            </w:r>
+          </w:p>
+        </w:tc>
+        <w:tc>
+          <w:tcPr/>
+          <w:p>
+            <w:pPr>
+              <w:pStyle w:val="Compact"/>
+              <w:jc w:val="right"/>
+            </w:pPr>
+            <w:r>
+              <w:t xml:space="preserve">n pairs</w:t>
+            </w:r>
+          </w:p>
+        </w:tc>
+        <w:tc>
+          <w:tcPr/>
+          <w:p>
+            <w:pPr>
+              <w:pStyle w:val="Compact"/>
+              <w:jc w:val="right"/>
+            </w:pPr>
+            <w:r>
+              <w:t xml:space="preserve">Syn2b (ms/pair)</w:t>
+            </w:r>
+          </w:p>
+        </w:tc>
+        <w:tc>
+          <w:tcPr/>
+          <w:p>
+            <w:pPr>
+              <w:pStyle w:val="Compact"/>
+              <w:jc w:val="right"/>
+            </w:pPr>
+            <w:r>
+              <w:t xml:space="preserve">skani (ms/pair)</w:t>
+            </w:r>
+          </w:p>
+        </w:tc>
+        <w:tc>
+          <w:tcPr/>
+          <w:p>
+            <w:pPr>
+              <w:pStyle w:val="Compact"/>
+              <w:jc w:val="right"/>
+            </w:pPr>
+            <w:r>
+              <w:t xml:space="preserve">dnadiff (s/pair)</w:t>
+            </w:r>
+          </w:p>
+        </w:tc>
+        <w:tc>
+          <w:tcPr/>
+          <w:p>
+            <w:pPr>
+              <w:pStyle w:val="Compact"/>
+              <w:jc w:val="right"/>
+            </w:pPr>
+            <w:r>
+              <w:t xml:space="preserve">skani+dnadiff (s/pair)</w:t>
+            </w:r>
+          </w:p>
+        </w:tc>
+        <w:tc>
+          <w:tcPr/>
+          <w:p>
+            <w:pPr>
+              <w:pStyle w:val="Compact"/>
+              <w:jc w:val="right"/>
+            </w:pPr>
+            <w:r>
+              <w:t xml:space="preserve">Syn2b speedup vs skani+dnadiff</w:t>
+            </w:r>
+          </w:p>
+        </w:tc>
+      </w:tr>
+      <w:tr>
+        <w:tc>
+          <w:tcPr/>
+          <w:p>
+            <w:pPr>
+              <w:pStyle w:val="Compact"/>
+            </w:pPr>
+            <w:r>
+              <w:t xml:space="preserve">2</w:t>
+            </w:r>
+          </w:p>
+        </w:tc>
+        <w:tc>
+          <w:tcPr/>
+          <w:p>
+            <w:pPr>
+              <w:pStyle w:val="Compact"/>
+              <w:jc w:val="right"/>
+            </w:pPr>
+            <w:r>
+              <w:t xml:space="preserve">4</w:t>
+            </w:r>
+          </w:p>
+        </w:tc>
+        <w:tc>
+          <w:tcPr/>
+          <w:p>
+            <w:pPr>
+              <w:pStyle w:val="Compact"/>
+              <w:jc w:val="right"/>
+            </w:pPr>
+            <w:r>
+              <w:t xml:space="preserve">128.9</w:t>
+            </w:r>
+          </w:p>
+        </w:tc>
+        <w:tc>
+          <w:tcPr/>
+          <w:p>
+            <w:pPr>
+              <w:pStyle w:val="Compact"/>
+              <w:jc w:val="right"/>
+            </w:pPr>
+            <w:r>
+              <w:t xml:space="preserve">41.9</w:t>
+            </w:r>
+          </w:p>
+        </w:tc>
+        <w:tc>
+          <w:tcPr/>
+          <w:p>
+            <w:pPr>
+              <w:pStyle w:val="Compact"/>
+              <w:jc w:val="right"/>
+            </w:pPr>
+            <w:r>
+              <w:t xml:space="preserve">4.91</w:t>
+            </w:r>
+          </w:p>
+        </w:tc>
+        <w:tc>
+          <w:tcPr/>
+          <w:p>
+            <w:pPr>
+              <w:pStyle w:val="Compact"/>
+              <w:jc w:val="right"/>
+            </w:pPr>
+            <w:r>
+              <w:t xml:space="preserve">4.95</w:t>
+            </w:r>
+          </w:p>
+        </w:tc>
+        <w:tc>
+          <w:tcPr/>
+          <w:p>
+            <w:pPr>
+              <w:pStyle w:val="Compact"/>
+              <w:jc w:val="right"/>
+            </w:pPr>
+            <w:r>
+              <w:t xml:space="preserve">38x</w:t>
+            </w:r>
+          </w:p>
+        </w:tc>
+      </w:tr>
+      <w:tr>
+        <w:tc>
+          <w:tcPr/>
+          <w:p>
+            <w:pPr>
+              <w:pStyle w:val="Compact"/>
+            </w:pPr>
+            <w:r>
+              <w:t xml:space="preserve">5</w:t>
+            </w:r>
+          </w:p>
+        </w:tc>
+        <w:tc>
+          <w:tcPr/>
+          <w:p>
+            <w:pPr>
+              <w:pStyle w:val="Compact"/>
+              <w:jc w:val="right"/>
+            </w:pPr>
+            <w:r>
+              <w:t xml:space="preserve">25</w:t>
+            </w:r>
+          </w:p>
+        </w:tc>
+        <w:tc>
+          <w:tcPr/>
+          <w:p>
+            <w:pPr>
+              <w:pStyle w:val="Compact"/>
+              <w:jc w:val="right"/>
+            </w:pPr>
+            <w:r>
+              <w:t xml:space="preserve">15.9</w:t>
+            </w:r>
+          </w:p>
+        </w:tc>
+        <w:tc>
+          <w:tcPr/>
+          <w:p>
+            <w:pPr>
+              <w:pStyle w:val="Compact"/>
+              <w:jc w:val="right"/>
+            </w:pPr>
+            <w:r>
+              <w:t xml:space="preserve">5.9</w:t>
+            </w:r>
+          </w:p>
+        </w:tc>
+        <w:tc>
+          <w:tcPr/>
+          <w:p>
+            <w:pPr>
+              <w:pStyle w:val="Compact"/>
+              <w:jc w:val="right"/>
+            </w:pPr>
+            <w:r>
+              <w:t xml:space="preserve">1.62</w:t>
+            </w:r>
+          </w:p>
+        </w:tc>
+        <w:tc>
+          <w:tcPr/>
+          <w:p>
+            <w:pPr>
+              <w:pStyle w:val="Compact"/>
+              <w:jc w:val="right"/>
+            </w:pPr>
+            <w:r>
+              <w:t xml:space="preserve">1.62</w:t>
+            </w:r>
+          </w:p>
+        </w:tc>
+        <w:tc>
+          <w:tcPr/>
+          <w:p>
+            <w:pPr>
+              <w:pStyle w:val="Compact"/>
+              <w:jc w:val="right"/>
+            </w:pPr>
+            <w:r>
+              <w:t xml:space="preserve">102x</w:t>
+            </w:r>
+          </w:p>
+        </w:tc>
+      </w:tr>
+      <w:tr>
+        <w:tc>
+          <w:tcPr/>
+          <w:p>
+            <w:pPr>
+              <w:pStyle w:val="Compact"/>
+            </w:pPr>
+            <w:r>
+              <w:t xml:space="preserve">10</w:t>
+            </w:r>
+          </w:p>
+        </w:tc>
+        <w:tc>
+          <w:tcPr/>
+          <w:p>
+            <w:pPr>
+              <w:pStyle w:val="Compact"/>
+              <w:jc w:val="right"/>
+            </w:pPr>
+            <w:r>
+              <w:t xml:space="preserve">100</w:t>
+            </w:r>
+          </w:p>
+        </w:tc>
+        <w:tc>
+          <w:tcPr/>
+          <w:p>
+            <w:pPr>
+              <w:pStyle w:val="Compact"/>
+              <w:jc w:val="right"/>
+            </w:pPr>
+            <w:r>
+              <w:t xml:space="preserve">10.4</w:t>
+            </w:r>
+          </w:p>
+        </w:tc>
+        <w:tc>
+          <w:tcPr/>
+          <w:p>
+            <w:pPr>
+              <w:pStyle w:val="Compact"/>
+              <w:jc w:val="right"/>
+            </w:pPr>
+            <w:r>
+              <w:t xml:space="preserve">3.0</w:t>
+            </w:r>
+          </w:p>
+        </w:tc>
+        <w:tc>
+          <w:tcPr/>
+          <w:p>
+            <w:pPr>
+              <w:pStyle w:val="Compact"/>
+              <w:jc w:val="right"/>
+            </w:pPr>
+            <w:r>
+              <w:t xml:space="preserve">2.62</w:t>
+            </w:r>
+          </w:p>
+        </w:tc>
+        <w:tc>
+          <w:tcPr/>
+          <w:p>
+            <w:pPr>
+              <w:pStyle w:val="Compact"/>
+              <w:jc w:val="right"/>
+            </w:pPr>
+            <w:r>
+              <w:t xml:space="preserve">2.63</w:t>
+            </w:r>
+          </w:p>
+        </w:tc>
+        <w:tc>
+          <w:tcPr/>
+          <w:p>
+            <w:pPr>
+              <w:pStyle w:val="Compact"/>
+              <w:jc w:val="right"/>
+            </w:pPr>
+            <w:r>
+              <w:t xml:space="preserve">251x</w:t>
+            </w:r>
+          </w:p>
+        </w:tc>
+      </w:tr>
+      <w:tr>
+        <w:tc>
+          <w:tcPr/>
+          <w:p>
+            <w:pPr>
+              <w:pStyle w:val="Compact"/>
+            </w:pPr>
+            <w:r>
+              <w:t xml:space="preserve">15</w:t>
+            </w:r>
+          </w:p>
+        </w:tc>
+        <w:tc>
+          <w:tcPr/>
+          <w:p>
+            <w:pPr>
+              <w:pStyle w:val="Compact"/>
+              <w:jc w:val="right"/>
+            </w:pPr>
+            <w:r>
+              <w:t xml:space="preserve">225</w:t>
+            </w:r>
+          </w:p>
+        </w:tc>
+        <w:tc>
+          <w:tcPr/>
+          <w:p>
+            <w:pPr>
+              <w:pStyle w:val="Compact"/>
+              <w:jc w:val="right"/>
+            </w:pPr>
+            <w:r>
+              <w:t xml:space="preserve">10.3</w:t>
+            </w:r>
+          </w:p>
+        </w:tc>
+        <w:tc>
+          <w:tcPr/>
+          <w:p>
+            <w:pPr>
+              <w:pStyle w:val="Compact"/>
+              <w:jc w:val="right"/>
+            </w:pPr>
+            <w:r>
+              <w:t xml:space="preserve">2.3</w:t>
+            </w:r>
+          </w:p>
+        </w:tc>
+        <w:tc>
+          <w:tcPr/>
+          <w:p>
+            <w:pPr>
+              <w:pStyle w:val="Compact"/>
+              <w:jc w:val="right"/>
+            </w:pPr>
+            <w:r>
+              <w:t xml:space="preserve">7.01</w:t>
+            </w:r>
+          </w:p>
+        </w:tc>
+        <w:tc>
+          <w:tcPr/>
+          <w:p>
+            <w:pPr>
+              <w:pStyle w:val="Compact"/>
+              <w:jc w:val="right"/>
+            </w:pPr>
+            <w:r>
+              <w:t xml:space="preserve">7.02</w:t>
+            </w:r>
+          </w:p>
+        </w:tc>
+        <w:tc>
+          <w:tcPr/>
+          <w:p>
+            <w:pPr>
+              <w:pStyle w:val="Compact"/>
+              <w:jc w:val="right"/>
+            </w:pPr>
+            <w:r>
+              <w:t xml:space="preserve">684x</w:t>
+            </w:r>
+          </w:p>
+        </w:tc>
+      </w:tr>
+      <w:tr>
+        <w:tc>
+          <w:tcPr/>
+          <w:p>
+            <w:pPr>
+              <w:pStyle w:val="Compact"/>
+            </w:pPr>
+            <w:r>
+              <w:t xml:space="preserve">22</w:t>
+            </w:r>
+          </w:p>
+        </w:tc>
+        <w:tc>
+          <w:tcPr/>
+          <w:p>
+            <w:pPr>
+              <w:pStyle w:val="Compact"/>
+              <w:jc w:val="right"/>
+            </w:pPr>
+            <w:r>
+              <w:t xml:space="preserve">484</w:t>
+            </w:r>
+          </w:p>
+        </w:tc>
+        <w:tc>
+          <w:tcPr/>
+          <w:p>
+            <w:pPr>
+              <w:pStyle w:val="Compact"/>
+              <w:jc w:val="right"/>
+            </w:pPr>
+            <w:r>
+              <w:t xml:space="preserve">9.0</w:t>
+            </w:r>
+          </w:p>
+        </w:tc>
+        <w:tc>
+          <w:tcPr/>
+          <w:p>
+            <w:pPr>
+              <w:pStyle w:val="Compact"/>
+              <w:jc w:val="right"/>
+            </w:pPr>
+            <w:r>
+              <w:t xml:space="preserve">1.1</w:t>
+            </w:r>
+          </w:p>
+        </w:tc>
+        <w:tc>
+          <w:tcPr/>
+          <w:p>
+            <w:pPr>
+              <w:pStyle w:val="Compact"/>
+              <w:jc w:val="right"/>
+            </w:pPr>
+            <w:r>
+              <w:t xml:space="preserve">3.81</w:t>
+            </w:r>
+          </w:p>
+        </w:tc>
+        <w:tc>
+          <w:tcPr/>
+          <w:p>
+            <w:pPr>
+              <w:pStyle w:val="Compact"/>
+              <w:jc w:val="right"/>
+            </w:pPr>
+            <w:r>
+              <w:t xml:space="preserve">3.81</w:t>
+            </w:r>
+          </w:p>
+        </w:tc>
+        <w:tc>
+          <w:tcPr/>
+          <w:p>
+            <w:pPr>
+              <w:pStyle w:val="Compact"/>
+              <w:jc w:val="right"/>
+            </w:pPr>
+            <w:r>
+              <w:t xml:space="preserve">423x</w:t>
+            </w:r>
+          </w:p>
+        </w:tc>
+      </w:tr>
+    </w:tbl>
+    <w:p>
+      <w:pPr>
+        <w:pStyle w:val="BodyText"/>
+      </w:pPr>
+      <w:r>
+        <w:rPr>
+          <w:b/>
+          <w:bCs/>
+        </w:rPr>
+        <w:t xml:space="preserve">Supplementary Table 4.</w:t>
+      </w:r>
+      <w:r>
+        <w:t xml:space="preserve"> </w:t>
+      </w:r>
+      <w:r>
+        <w:t xml:space="preserve">Head-to-head runtime on the 22-genome panel</w:t>
+      </w:r>
+      <w:r>
+        <w:t xml:space="preserve"> </w:t>
+      </w:r>
+      <w:r>
+        <w:t xml:space="preserve">(484 ordered pairs, mean of three replicates). SynTracker was not timed because</w:t>
+      </w:r>
+      <w:r>
+        <w:t xml:space="preserve"> </w:t>
+      </w:r>
+      <w:r>
+        <w:t xml:space="preserve">its DECIPHER R dependency is unavailable on the HPC; dnadiff (MUMmer) is the</w:t>
+      </w:r>
+      <w:r>
+        <w:t xml:space="preserve"> </w:t>
+      </w:r>
+      <w:r>
+        <w:t xml:space="preserve">alignment-based SV representative.</w:t>
+      </w:r>
+    </w:p>
+    <w:tbl>
+      <w:tblPr>
+        <w:tblStyle w:val="Table"/>
+        <w:tblW w:type="pct" w:w="5000"/>
+        <w:tblLayout w:type="fixed"/>
+        <w:tblLook w:firstRow="1" w:lastRow="0" w:firstColumn="0" w:lastColumn="0" w:noHBand="0" w:noVBand="0" w:val="0020"/>
+      </w:tblPr>
+      <w:tblGrid>
+        <w:gridCol w:w="1397"/>
+        <w:gridCol w:w="1863"/>
+        <w:gridCol w:w="1863"/>
+        <w:gridCol w:w="1397"/>
+        <w:gridCol w:w="1397"/>
+      </w:tblGrid>
+      <w:tr>
+        <w:trPr>
+          <w:tblHeader w:val="on"/>
+        </w:trPr>
+        <w:tc>
+          <w:tcPr/>
+          <w:p>
+            <w:pPr>
+              <w:pStyle w:val="Compact"/>
+            </w:pPr>
+            <w:r>
+              <w:t xml:space="preserve">tool</w:t>
+            </w:r>
+          </w:p>
+        </w:tc>
+        <w:tc>
+          <w:tcPr/>
+          <w:p>
+            <w:pPr>
+              <w:pStyle w:val="Compact"/>
+              <w:jc w:val="right"/>
+            </w:pPr>
+            <w:r>
+              <w:t xml:space="preserve">wall time (s)</w:t>
+            </w:r>
+          </w:p>
+        </w:tc>
+        <w:tc>
+          <w:tcPr/>
+          <w:p>
+            <w:pPr>
+              <w:pStyle w:val="Compact"/>
+              <w:jc w:val="right"/>
+            </w:pPr>
+            <w:r>
+              <w:t xml:space="preserve">per pair (s)</w:t>
+            </w:r>
+          </w:p>
+        </w:tc>
+        <w:tc>
+          <w:tcPr/>
+          <w:p>
+            <w:pPr>
+              <w:pStyle w:val="Compact"/>
+            </w:pPr>
+            <w:r>
+              <w:t xml:space="preserve">reports ANI</w:t>
+            </w:r>
+          </w:p>
+        </w:tc>
+        <w:tc>
+          <w:tcPr/>
+          <w:p>
+            <w:pPr>
+              <w:pStyle w:val="Compact"/>
+            </w:pPr>
+            <w:r>
+              <w:t xml:space="preserve">reports SV</w:t>
+            </w:r>
+          </w:p>
+        </w:tc>
+      </w:tr>
+      <w:tr>
+        <w:tc>
+          <w:tcPr/>
+          <w:p>
+            <w:pPr>
+              <w:pStyle w:val="Compact"/>
+            </w:pPr>
+            <w:r>
+              <w:t xml:space="preserve">Syn2b</w:t>
+            </w:r>
+          </w:p>
+        </w:tc>
+        <w:tc>
+          <w:tcPr/>
+          <w:p>
+            <w:pPr>
+              <w:pStyle w:val="Compact"/>
+              <w:jc w:val="right"/>
+            </w:pPr>
+            <w:r>
+              <w:t xml:space="preserve">4.4</w:t>
+            </w:r>
+          </w:p>
+        </w:tc>
+        <w:tc>
+          <w:tcPr/>
+          <w:p>
+            <w:pPr>
+              <w:pStyle w:val="Compact"/>
+              <w:jc w:val="right"/>
+            </w:pPr>
+            <w:r>
+              <w:t xml:space="preserve">0.009</w:t>
+            </w:r>
+          </w:p>
+        </w:tc>
+        <w:tc>
+          <w:tcPr/>
+          <w:p>
+            <w:pPr>
+              <w:pStyle w:val="Compact"/>
+            </w:pPr>
+            <w:r>
+              <w:t xml:space="preserve">no</w:t>
+            </w:r>
+          </w:p>
+        </w:tc>
+        <w:tc>
+          <w:tcPr/>
+          <w:p>
+            <w:pPr>
+              <w:pStyle w:val="Compact"/>
+            </w:pPr>
+            <w:r>
+              <w:t xml:space="preserve">yes (inverted fraction, junctions)</w:t>
+            </w:r>
+          </w:p>
+        </w:tc>
+      </w:tr>
+      <w:tr>
+        <w:tc>
+          <w:tcPr/>
+          <w:p>
+            <w:pPr>
+              <w:pStyle w:val="Compact"/>
+            </w:pPr>
+            <w:r>
+              <w:t xml:space="preserve">skani</w:t>
+            </w:r>
+          </w:p>
+        </w:tc>
+        <w:tc>
+          <w:tcPr/>
+          <w:p>
+            <w:pPr>
+              <w:pStyle w:val="Compact"/>
+              <w:jc w:val="right"/>
+            </w:pPr>
+            <w:r>
+              <w:t xml:space="preserve">0.5</w:t>
+            </w:r>
+          </w:p>
+        </w:tc>
+        <w:tc>
+          <w:tcPr/>
+          <w:p>
+            <w:pPr>
+              <w:pStyle w:val="Compact"/>
+              <w:jc w:val="right"/>
+            </w:pPr>
+            <w:r>
+              <w:t xml:space="preserve">0.001</w:t>
+            </w:r>
+          </w:p>
+        </w:tc>
+        <w:tc>
+          <w:tcPr/>
+          <w:p>
+            <w:pPr>
+              <w:pStyle w:val="Compact"/>
+            </w:pPr>
+            <w:r>
+              <w:t xml:space="preserve">yes</w:t>
+            </w:r>
+          </w:p>
+        </w:tc>
+        <w:tc>
+          <w:tcPr/>
+          <w:p>
+            <w:pPr>
+              <w:pStyle w:val="Compact"/>
+            </w:pPr>
+            <w:r>
+              <w:t xml:space="preserve">no</w:t>
+            </w:r>
+          </w:p>
+        </w:tc>
+      </w:tr>
+      <w:tr>
+        <w:tc>
+          <w:tcPr/>
+          <w:p>
+            <w:pPr>
+              <w:pStyle w:val="Compact"/>
+            </w:pPr>
+            <w:r>
+              <w:t xml:space="preserve">dnadiff (MUMmer)</w:t>
+            </w:r>
+          </w:p>
+        </w:tc>
+        <w:tc>
+          <w:tcPr/>
+          <w:p>
+            <w:pPr>
+              <w:pStyle w:val="Compact"/>
+              <w:jc w:val="right"/>
+            </w:pPr>
+            <w:r>
+              <w:t xml:space="preserve">1,843.9</w:t>
+            </w:r>
+          </w:p>
+        </w:tc>
+        <w:tc>
+          <w:tcPr/>
+          <w:p>
+            <w:pPr>
+              <w:pStyle w:val="Compact"/>
+              <w:jc w:val="right"/>
+            </w:pPr>
+            <w:r>
+              <w:t xml:space="preserve">3.810</w:t>
+            </w:r>
+          </w:p>
+        </w:tc>
+        <w:tc>
+          <w:tcPr/>
+          <w:p>
+            <w:pPr>
+              <w:pStyle w:val="Compact"/>
+            </w:pPr>
+            <w:r>
+              <w:t xml:space="preserve">no</w:t>
+            </w:r>
+          </w:p>
+        </w:tc>
+        <w:tc>
+          <w:tcPr/>
+          <w:p>
+            <w:pPr>
+              <w:pStyle w:val="Compact"/>
+            </w:pPr>
+            <w:r>
+              <w:t xml:space="preserve">yes (alignment-based truth)</w:t>
+            </w:r>
+          </w:p>
+        </w:tc>
+      </w:tr>
+      <w:tr>
+        <w:tc>
+          <w:tcPr/>
+          <w:p>
+            <w:pPr>
+              <w:pStyle w:val="Compact"/>
+            </w:pPr>
+            <w:r>
+              <w:t xml:space="preserve">skani + dnadiff</w:t>
+            </w:r>
+          </w:p>
+        </w:tc>
+        <w:tc>
+          <w:tcPr/>
+          <w:p>
+            <w:pPr>
+              <w:pStyle w:val="Compact"/>
+              <w:jc w:val="right"/>
+            </w:pPr>
+            <w:r>
+              <w:t xml:space="preserve">1,844.5</w:t>
+            </w:r>
+          </w:p>
+        </w:tc>
+        <w:tc>
+          <w:tcPr/>
+          <w:p>
+            <w:pPr>
+              <w:pStyle w:val="Compact"/>
+              <w:jc w:val="right"/>
+            </w:pPr>
+            <w:r>
+              <w:t xml:space="preserve">3.811</w:t>
+            </w:r>
+          </w:p>
+        </w:tc>
+        <w:tc>
+          <w:tcPr/>
+          <w:p>
+            <w:pPr>
+              <w:pStyle w:val="Compact"/>
+            </w:pPr>
+            <w:r>
+              <w:t xml:space="preserve">yes</w:t>
+            </w:r>
+          </w:p>
+        </w:tc>
+        <w:tc>
+          <w:tcPr/>
+          <w:p>
+            <w:pPr>
+              <w:pStyle w:val="Compact"/>
+            </w:pPr>
+            <w:r>
+              <w:t xml:space="preserve">yes</w:t>
+            </w:r>
+          </w:p>
+        </w:tc>
+      </w:tr>
+    </w:tbl>
     <w:bookmarkEnd w:id="30"/>
     <w:bookmarkStart w:id="31" w:name="supplementary-figures"/>
     <w:p>

</xml_diff>

<commit_message>
Benchmark SynTracker on HPC and add measured runtimes to Supplementary Tables 2 and 4
</commit_message>
<xml_diff>
--- a/Syn2b_Manuscript.docx
+++ b/Syn2b_Manuscript.docx
@@ -3843,25 +3843,25 @@
         <w:t xml:space="preserve"> </w:t>
       </w:r>
       <w:r>
-        <w:t xml:space="preserve">sizes. SynTracker itself was not timed because its DECIPHER R dependency is not</w:t>
-      </w:r>
-      <w:r>
-        <w:t xml:space="preserve"> </w:t>
-      </w:r>
-      <w:r>
-        <w:t xml:space="preserve">available on our HPC, but its BLAST database construction and all-versus-all</w:t>
-      </w:r>
-      <w:r>
-        <w:t xml:space="preserve"> </w:t>
-      </w:r>
-      <w:r>
-        <w:t xml:space="preserve">DECIPHER alignment are at least as expensive as the nucmer-based dnadiff stage</w:t>
-      </w:r>
-      <w:r>
-        <w:t xml:space="preserve"> </w:t>
-      </w:r>
-      <w:r>
-        <w:t xml:space="preserve">benchmarked here.</w:t>
+        <w:t xml:space="preserve">sizes. SynTracker, the microsynteny alternative, required 65,162 s (18.1 h) on</w:t>
+      </w:r>
+      <w:r>
+        <w:t xml:space="preserve"> </w:t>
+      </w:r>
+      <w:r>
+        <w:t xml:space="preserve">the same 22-genome panel even with 16 cores — ~15,000-fold slower than Syn2b —</w:t>
+      </w:r>
+      <w:r>
+        <w:t xml:space="preserve"> </w:t>
+      </w:r>
+      <w:r>
+        <w:t xml:space="preserve">consistent with its BLAST database construction and all-versus-all DECIPHER</w:t>
+      </w:r>
+      <w:r>
+        <w:t xml:space="preserve"> </w:t>
+      </w:r>
+      <w:r>
+        <w:t xml:space="preserve">alignment being at least as expensive as the nucmer-based dnadiff stage.</w:t>
       </w:r>
     </w:p>
     <w:p>
@@ -3941,7 +3941,25 @@
         <w:t xml:space="preserve"> </w:t>
       </w:r>
       <w:r>
-        <w:t xml:space="preserve">all-versus-all DECIPHER alignments. Alignment-based SV callers such as dnadiff</w:t>
+        <w:t xml:space="preserve">all-versus-all DECIPHER alignments; on our 22-genome benchmark panel it needed</w:t>
+      </w:r>
+      <w:r>
+        <w:t xml:space="preserve"> </w:t>
+      </w:r>
+      <w:r>
+        <w:t xml:space="preserve">18.1 h on 16 cores (135 s per pair; Supplementary Table 4), about 15,000 times</w:t>
+      </w:r>
+      <w:r>
+        <w:t xml:space="preserve"> </w:t>
+      </w:r>
+      <w:r>
+        <w:t xml:space="preserve">slower than Syn2b for a comparable structural read-out. Alignment-based SV</w:t>
+      </w:r>
+      <w:r>
+        <w:t xml:space="preserve"> </w:t>
+      </w:r>
+      <w:r>
+        <w:t xml:space="preserve">callers such as dnadiff</w:t>
       </w:r>
       <w:r>
         <w:t xml:space="preserve"> </w:t>
@@ -7048,7 +7066,7 @@
         <w:t xml:space="preserve"> </w:t>
       </w:r>
       <w:r>
-        <w:t xml:space="preserve">skani, dnadiff, and skani+dnadiff across panel sizes</w:t>
+        <w:t xml:space="preserve">skani, dnadiff, skani+dnadiff, and SynTracker across panel sizes</w:t>
       </w:r>
       <w:r>
         <w:t xml:space="preserve"> </w:t>
@@ -7161,13 +7179,13 @@
         <w:t xml:space="preserve"> </w:t>
       </w:r>
       <w:r>
-        <w:t xml:space="preserve">means of three replicates on the HPC (16 cores for skani/dnadiff). Per-pair</w:t>
-      </w:r>
-      <w:r>
-        <w:t xml:space="preserve"> </w:t>
-      </w:r>
-      <w:r>
-        <w:t xml:space="preserve">times use the n² ordered pairs recorded in the benchmark.</w:t>
+        <w:t xml:space="preserve">means of three replicates on the HPC (16 cores for skani/dnadiff/SynTracker).</w:t>
+      </w:r>
+      <w:r>
+        <w:t xml:space="preserve"> </w:t>
+      </w:r>
+      <w:r>
+        <w:t xml:space="preserve">Per-pair times use the n² ordered pairs recorded in the benchmark.</w:t>
       </w:r>
     </w:p>
     <w:tbl>
@@ -7178,13 +7196,15 @@
         <w:tblLook w:firstRow="1" w:lastRow="0" w:firstColumn="0" w:lastColumn="0" w:noHBand="0" w:noVBand="0" w:val="0020"/>
       </w:tblPr>
       <w:tblGrid>
-        <w:gridCol w:w="880"/>
-        <w:gridCol w:w="1173"/>
-        <w:gridCol w:w="1173"/>
-        <w:gridCol w:w="1173"/>
-        <w:gridCol w:w="1173"/>
-        <w:gridCol w:w="1173"/>
-        <w:gridCol w:w="1173"/>
+        <w:gridCol w:w="678"/>
+        <w:gridCol w:w="905"/>
+        <w:gridCol w:w="905"/>
+        <w:gridCol w:w="905"/>
+        <w:gridCol w:w="905"/>
+        <w:gridCol w:w="905"/>
+        <w:gridCol w:w="905"/>
+        <w:gridCol w:w="905"/>
+        <w:gridCol w:w="905"/>
       </w:tblGrid>
       <w:tr>
         <w:trPr>
@@ -7269,7 +7289,31 @@
               <w:jc w:val="right"/>
             </w:pPr>
             <w:r>
+              <w:t xml:space="preserve">SynTracker (s/pair)</w:t>
+            </w:r>
+          </w:p>
+        </w:tc>
+        <w:tc>
+          <w:tcPr/>
+          <w:p>
+            <w:pPr>
+              <w:pStyle w:val="Compact"/>
+              <w:jc w:val="right"/>
+            </w:pPr>
+            <w:r>
               <w:t xml:space="preserve">Syn2b speedup vs skani+dnadiff</w:t>
+            </w:r>
+          </w:p>
+        </w:tc>
+        <w:tc>
+          <w:tcPr/>
+          <w:p>
+            <w:pPr>
+              <w:pStyle w:val="Compact"/>
+              <w:jc w:val="right"/>
+            </w:pPr>
+            <w:r>
+              <w:t xml:space="preserve">Syn2b speedup vs SynTracker</w:t>
             </w:r>
           </w:p>
         </w:tc>
@@ -7354,7 +7398,31 @@
               <w:jc w:val="right"/>
             </w:pPr>
             <w:r>
+              <w:t xml:space="preserve">1,116.8</w:t>
+            </w:r>
+          </w:p>
+        </w:tc>
+        <w:tc>
+          <w:tcPr/>
+          <w:p>
+            <w:pPr>
+              <w:pStyle w:val="Compact"/>
+              <w:jc w:val="right"/>
+            </w:pPr>
+            <w:r>
               <w:t xml:space="preserve">38x</w:t>
+            </w:r>
+          </w:p>
+        </w:tc>
+        <w:tc>
+          <w:tcPr/>
+          <w:p>
+            <w:pPr>
+              <w:pStyle w:val="Compact"/>
+              <w:jc w:val="right"/>
+            </w:pPr>
+            <w:r>
+              <w:t xml:space="preserve">8,663x</w:t>
             </w:r>
           </w:p>
         </w:tc>
@@ -7439,7 +7507,31 @@
               <w:jc w:val="right"/>
             </w:pPr>
             <w:r>
+              <w:t xml:space="preserve">748.4</w:t>
+            </w:r>
+          </w:p>
+        </w:tc>
+        <w:tc>
+          <w:tcPr/>
+          <w:p>
+            <w:pPr>
+              <w:pStyle w:val="Compact"/>
+              <w:jc w:val="right"/>
+            </w:pPr>
+            <w:r>
               <w:t xml:space="preserve">102x</w:t>
+            </w:r>
+          </w:p>
+        </w:tc>
+        <w:tc>
+          <w:tcPr/>
+          <w:p>
+            <w:pPr>
+              <w:pStyle w:val="Compact"/>
+              <w:jc w:val="right"/>
+            </w:pPr>
+            <w:r>
+              <w:t xml:space="preserve">46,971x</w:t>
             </w:r>
           </w:p>
         </w:tc>
@@ -7524,7 +7616,31 @@
               <w:jc w:val="right"/>
             </w:pPr>
             <w:r>
+              <w:t xml:space="preserve">388.4</w:t>
+            </w:r>
+          </w:p>
+        </w:tc>
+        <w:tc>
+          <w:tcPr/>
+          <w:p>
+            <w:pPr>
+              <w:pStyle w:val="Compact"/>
+              <w:jc w:val="right"/>
+            </w:pPr>
+            <w:r>
               <w:t xml:space="preserve">251x</w:t>
+            </w:r>
+          </w:p>
+        </w:tc>
+        <w:tc>
+          <w:tcPr/>
+          <w:p>
+            <w:pPr>
+              <w:pStyle w:val="Compact"/>
+              <w:jc w:val="right"/>
+            </w:pPr>
+            <w:r>
+              <w:t xml:space="preserve">37,171x</w:t>
             </w:r>
           </w:p>
         </w:tc>
@@ -7609,7 +7725,31 @@
               <w:jc w:val="right"/>
             </w:pPr>
             <w:r>
+              <w:t xml:space="preserve">n.d.</w:t>
+            </w:r>
+          </w:p>
+        </w:tc>
+        <w:tc>
+          <w:tcPr/>
+          <w:p>
+            <w:pPr>
+              <w:pStyle w:val="Compact"/>
+              <w:jc w:val="right"/>
+            </w:pPr>
+            <w:r>
               <w:t xml:space="preserve">684x</w:t>
+            </w:r>
+          </w:p>
+        </w:tc>
+        <w:tc>
+          <w:tcPr/>
+          <w:p>
+            <w:pPr>
+              <w:pStyle w:val="Compact"/>
+              <w:jc w:val="right"/>
+            </w:pPr>
+            <w:r>
+              <w:t xml:space="preserve">n.d.</w:t>
             </w:r>
           </w:p>
         </w:tc>
@@ -7694,7 +7834,31 @@
               <w:jc w:val="right"/>
             </w:pPr>
             <w:r>
+              <w:t xml:space="preserve">134.6</w:t>
+            </w:r>
+          </w:p>
+        </w:tc>
+        <w:tc>
+          <w:tcPr/>
+          <w:p>
+            <w:pPr>
+              <w:pStyle w:val="Compact"/>
+              <w:jc w:val="right"/>
+            </w:pPr>
+            <w:r>
               <w:t xml:space="preserve">423x</w:t>
+            </w:r>
+          </w:p>
+        </w:tc>
+        <w:tc>
+          <w:tcPr/>
+          <w:p>
+            <w:pPr>
+              <w:pStyle w:val="Compact"/>
+              <w:jc w:val="right"/>
+            </w:pPr>
+            <w:r>
+              <w:t xml:space="preserve">14,947x</w:t>
             </w:r>
           </w:p>
         </w:tc>
@@ -7721,19 +7885,7 @@
         <w:t xml:space="preserve"> </w:t>
       </w:r>
       <w:r>
-        <w:t xml:space="preserve">(484 ordered pairs, mean of three replicates). SynTracker was not timed because</w:t>
-      </w:r>
-      <w:r>
-        <w:t xml:space="preserve"> </w:t>
-      </w:r>
-      <w:r>
-        <w:t xml:space="preserve">its DECIPHER R dependency is unavailable on the HPC; dnadiff (MUMmer) is the</w:t>
-      </w:r>
-      <w:r>
-        <w:t xml:space="preserve"> </w:t>
-      </w:r>
-      <w:r>
-        <w:t xml:space="preserve">alignment-based SV representative.</w:t>
+        <w:t xml:space="preserve">(484 ordered pairs, mean of three replicates; SynTracker single run).</w:t>
       </w:r>
     </w:p>
     <w:tbl>
@@ -7985,6 +8137,65 @@
             </w:pPr>
             <w:r>
               <w:t xml:space="preserve">yes (alignment-based truth)</w:t>
+            </w:r>
+          </w:p>
+        </w:tc>
+      </w:tr>
+      <w:tr>
+        <w:tc>
+          <w:tcPr/>
+          <w:p>
+            <w:pPr>
+              <w:pStyle w:val="Compact"/>
+            </w:pPr>
+            <w:r>
+              <w:t xml:space="preserve">SynTracker (16 cores)</w:t>
+            </w:r>
+          </w:p>
+        </w:tc>
+        <w:tc>
+          <w:tcPr/>
+          <w:p>
+            <w:pPr>
+              <w:pStyle w:val="Compact"/>
+              <w:jc w:val="right"/>
+            </w:pPr>
+            <w:r>
+              <w:t xml:space="preserve">65,162.0</w:t>
+            </w:r>
+          </w:p>
+        </w:tc>
+        <w:tc>
+          <w:tcPr/>
+          <w:p>
+            <w:pPr>
+              <w:pStyle w:val="Compact"/>
+              <w:jc w:val="right"/>
+            </w:pPr>
+            <w:r>
+              <w:t xml:space="preserve">134.632</w:t>
+            </w:r>
+          </w:p>
+        </w:tc>
+        <w:tc>
+          <w:tcPr/>
+          <w:p>
+            <w:pPr>
+              <w:pStyle w:val="Compact"/>
+            </w:pPr>
+            <w:r>
+              <w:t xml:space="preserve">no</w:t>
+            </w:r>
+          </w:p>
+        </w:tc>
+        <w:tc>
+          <w:tcPr/>
+          <w:p>
+            <w:pPr>
+              <w:pStyle w:val="Compact"/>
+            </w:pPr>
+            <w:r>
+              <w:t xml:space="preserve">yes (gene synteny)</w:t>
             </w:r>
           </w:p>
         </w:tc>

</xml_diff>